<commit_message>
Update content, navigation, partners, footer, and doctor pages
- Add CASD news article (news-007) + list it across blog, home, team pages
- Add Screening 40+ logo to news-002 per brand guidelines
- Restructure UZD nav into 3 groups with a third-level dropdown
- Rename nav: "Розширена первинна медична допомога", vaccination label
- About page timeline: update 2019/2022/2025/2026 text, photos, chips
- About page values: reword "Довіра" and "Холістична опіка"
- Partners carousel: add 7 logos, show 7 at once, swap 4, enlarge logos
- Footer: add partner email column, move social icons under logo, drop title
- Contacts: 4-card row, smaller hero, partner card, grey CTA text
- Locations: Striyska +ГВ/ЕСОЗ services, Tychyny remove gynecology
- Set --primary to logo yellow; vacancies green accents -> grey
- Fill Лехоцінська and Пікулицька doctor bios from updated doc
- Misc: Mykhailo Pikulytskyi photo, prices declaration title

Co-Authored-By: Claude Opus 4.8 <noreply@anthropic.com>
</commit_message>
<xml_diff>
--- a/Info about employees/ІНФО _ ПЕРВИНКА.docx
+++ b/Info about employees/ІНФО _ ПЕРВИНКА.docx
@@ -40,16 +40,12 @@
           <w:b w:val="1"/>
           <w:bCs w:val="1"/>
           <w:color w:val="2f2e2e"/>
-          <w:sz w:val="24"/>
-          <w:szCs w:val="24"/>
-        </w:rPr>
-      </w:pPr>
-      <w:r>
-        <w:rPr>
-          <w:b w:val="1"/>
-          <w:bCs w:val="1"/>
-          <w:sz w:val="24"/>
-          <w:szCs w:val="24"/>
+        </w:rPr>
+      </w:pPr>
+      <w:r>
+        <w:rPr>
+          <w:b w:val="1"/>
+          <w:bCs w:val="1"/>
           <w:rtl w:val="0"/>
         </w:rPr>
         <w:t xml:space="preserve">1. МАРІАННА КОГУТ - </w:t>
@@ -59,8 +55,6 @@
           <w:b w:val="1"/>
           <w:bCs w:val="1"/>
           <w:color w:val="2f2e2e"/>
-          <w:sz w:val="24"/>
-          <w:szCs w:val="24"/>
           <w:rtl w:val="0"/>
         </w:rPr>
         <w:t xml:space="preserve">медична директорка,</w:t>
@@ -79,17 +73,13 @@
           <w:b w:val="1"/>
           <w:bCs w:val="1"/>
           <w:color w:val="2f2e2e"/>
-          <w:sz w:val="24"/>
-          <w:szCs w:val="24"/>
-        </w:rPr>
-      </w:pPr>
-      <w:r>
-        <w:rPr>
-          <w:b w:val="1"/>
-          <w:bCs w:val="1"/>
-          <w:color w:val="2f2e2e"/>
-          <w:sz w:val="24"/>
-          <w:szCs w:val="24"/>
+        </w:rPr>
+      </w:pPr>
+      <w:r>
+        <w:rPr>
+          <w:b w:val="1"/>
+          <w:bCs w:val="1"/>
+          <w:color w:val="2f2e2e"/>
           <w:rtl w:val="0"/>
         </w:rPr>
         <w:t xml:space="preserve">сімейна лікарка, лікар УЗД-діагностики, дипломована спеціалістка з педіатрії, стипендіатка приватних та Президентських програм</w:t>
@@ -100,24 +90,18 @@
         <w:rPr>
           <w:b w:val="1"/>
           <w:bCs w:val="1"/>
-          <w:sz w:val="24"/>
-          <w:szCs w:val="24"/>
-        </w:rPr>
-      </w:pPr>
-      <w:r>
-        <w:rPr>
-          <w:b w:val="1"/>
-          <w:bCs w:val="1"/>
-          <w:sz w:val="24"/>
-          <w:szCs w:val="24"/>
+        </w:rPr>
+      </w:pPr>
+      <w:r>
+        <w:rPr>
+          <w:b w:val="1"/>
+          <w:bCs w:val="1"/>
           <w:rtl w:val="0"/>
         </w:rPr>
         <w:t xml:space="preserve">Освіта:</w:t>
       </w:r>
       <w:r>
         <w:rPr>
-          <w:sz w:val="24"/>
-          <w:szCs w:val="24"/>
           <w:rtl w:val="0"/>
         </w:rPr>
         <w:t xml:space="preserve"> Закінчила Львівський медичний коледж імені Андрея Крупинського та Львівський національний медичний університет імені Данила Галицького </w:t>
@@ -130,25 +114,18 @@
     </w:p>
     <w:p>
       <w:pPr>
-        <w:rPr>
-          <w:sz w:val="24"/>
-          <w:szCs w:val="24"/>
-        </w:rPr>
-      </w:pPr>
-      <w:r>
-        <w:rPr>
-          <w:b w:val="1"/>
-          <w:bCs w:val="1"/>
-          <w:sz w:val="24"/>
-          <w:szCs w:val="24"/>
+        <w:rPr/>
+      </w:pPr>
+      <w:r>
+        <w:rPr>
+          <w:b w:val="1"/>
+          <w:bCs w:val="1"/>
           <w:rtl w:val="0"/>
         </w:rPr>
         <w:t xml:space="preserve">Чому обрала цю професію: </w:t>
       </w:r>
       <w:r>
         <w:rPr>
-          <w:sz w:val="24"/>
-          <w:szCs w:val="24"/>
           <w:rtl w:val="0"/>
         </w:rPr>
         <w:t xml:space="preserve">Стала лікарем , бо з дитинства хотіла допомагати людям і працювати з людьми. Стаж роботи 10+ Працюю сімейний лікарем , медичним директором і трішки лікарем УЗД </w:t>
@@ -160,24 +137,18 @@
           <w:b w:val="1"/>
           <w:bCs w:val="1"/>
           <w:color w:val="2f2e2e"/>
-          <w:sz w:val="24"/>
-          <w:szCs w:val="24"/>
-        </w:rPr>
-      </w:pPr>
-      <w:r>
-        <w:rPr>
-          <w:b w:val="1"/>
-          <w:bCs w:val="1"/>
-          <w:sz w:val="24"/>
-          <w:szCs w:val="24"/>
+        </w:rPr>
+      </w:pPr>
+      <w:r>
+        <w:rPr>
+          <w:b w:val="1"/>
+          <w:bCs w:val="1"/>
           <w:rtl w:val="0"/>
         </w:rPr>
         <w:t xml:space="preserve">Про себе: </w:t>
       </w:r>
       <w:r>
         <w:rPr>
-          <w:sz w:val="24"/>
-          <w:szCs w:val="24"/>
           <w:rtl w:val="0"/>
         </w:rPr>
         <w:t xml:space="preserve">Люблю читати книги , люблю різні мандрівки , хай навіть короткі та недалекі , дуже люблю слухати музику , це мій релакс, люблю активний відпочинок . Маю велике бажання змінити ставлення людей до свого здоровʼя , особливо до онкопрофілактики , тому стараюся докладати максимум зусиль для цього</w:t>
@@ -187,8 +158,6 @@
           <w:b w:val="1"/>
           <w:bCs w:val="1"/>
           <w:color w:val="2f2e2e"/>
-          <w:sz w:val="24"/>
-          <w:szCs w:val="24"/>
           <w:rtl w:val="0"/>
         </w:rPr>
         <w:t xml:space="preserve">.</w:t>
@@ -198,17 +167,13 @@
       <w:pPr>
         <w:rPr>
           <w:color w:val="2f2e2e"/>
-          <w:sz w:val="24"/>
-          <w:szCs w:val="24"/>
-        </w:rPr>
-      </w:pPr>
-      <w:r>
-        <w:rPr>
-          <w:b w:val="1"/>
-          <w:bCs w:val="1"/>
-          <w:color w:val="2f2e2e"/>
-          <w:sz w:val="24"/>
-          <w:szCs w:val="24"/>
+        </w:rPr>
+      </w:pPr>
+      <w:r>
+        <w:rPr>
+          <w:b w:val="1"/>
+          <w:bCs w:val="1"/>
+          <w:color w:val="2f2e2e"/>
           <w:rtl w:val="0"/>
         </w:rPr>
         <w:t xml:space="preserve">Локація:</w:t>
@@ -216,8 +181,6 @@
       <w:r>
         <w:rPr>
           <w:color w:val="2f2e2e"/>
-          <w:sz w:val="24"/>
-          <w:szCs w:val="24"/>
           <w:rtl w:val="0"/>
         </w:rPr>
         <w:t xml:space="preserve">м.Львів, вул.Тичини 21 м.Львів вул.Стрийська 86В</w:t>
@@ -225,23 +188,17 @@
     </w:p>
     <w:p>
       <w:pPr>
-        <w:rPr>
-          <w:sz w:val="24"/>
-          <w:szCs w:val="24"/>
-        </w:rPr>
-      </w:pPr>
-      <w:r>
-        <w:rPr>
-          <w:rtl w:val="0"/>
-        </w:rPr>
-      </w:r>
-    </w:p>
-    <w:p>
-      <w:pPr>
-        <w:rPr>
-          <w:sz w:val="24"/>
-          <w:szCs w:val="24"/>
-        </w:rPr>
+        <w:rPr/>
+      </w:pPr>
+      <w:r>
+        <w:rPr>
+          <w:rtl w:val="0"/>
+        </w:rPr>
+      </w:r>
+    </w:p>
+    <w:p>
+      <w:pPr>
+        <w:rPr/>
       </w:pPr>
       <w:r>
         <w:pict>
@@ -256,32 +213,25 @@
     </w:p>
     <w:p>
       <w:pPr>
-        <w:rPr>
-          <w:sz w:val="24"/>
-          <w:szCs w:val="24"/>
-        </w:rPr>
-      </w:pPr>
-      <w:r>
-        <w:rPr>
-          <w:rtl w:val="0"/>
-        </w:rPr>
-      </w:r>
-    </w:p>
-    <w:p>
-      <w:pPr>
-        <w:rPr>
-          <w:b w:val="1"/>
-          <w:bCs w:val="1"/>
-          <w:sz w:val="24"/>
-          <w:szCs w:val="24"/>
-        </w:rPr>
-      </w:pPr>
-      <w:r>
-        <w:rPr>
-          <w:b w:val="1"/>
-          <w:bCs w:val="1"/>
-          <w:sz w:val="24"/>
-          <w:szCs w:val="24"/>
+        <w:rPr/>
+      </w:pPr>
+      <w:r>
+        <w:rPr>
+          <w:rtl w:val="0"/>
+        </w:rPr>
+      </w:r>
+    </w:p>
+    <w:p>
+      <w:pPr>
+        <w:rPr>
+          <w:b w:val="1"/>
+          <w:bCs w:val="1"/>
+        </w:rPr>
+      </w:pPr>
+      <w:r>
+        <w:rPr>
+          <w:b w:val="1"/>
+          <w:bCs w:val="1"/>
           <w:rtl w:val="0"/>
         </w:rPr>
         <w:t xml:space="preserve">2. ХРИСТИНА ВОЗЬНА - </w:t>
@@ -290,8 +240,6 @@
         <w:rPr>
           <w:b w:val="1"/>
           <w:bCs w:val="1"/>
-          <w:sz w:val="24"/>
-          <w:szCs w:val="24"/>
           <w:rtl w:val="0"/>
         </w:rPr>
         <w:t xml:space="preserve">лікар-педіатр, лікар ультразвукової діагностики</w:t>
@@ -299,25 +247,18 @@
     </w:p>
     <w:p>
       <w:pPr>
-        <w:rPr>
-          <w:sz w:val="24"/>
-          <w:szCs w:val="24"/>
-        </w:rPr>
-      </w:pPr>
-      <w:r>
-        <w:rPr>
-          <w:b w:val="1"/>
-          <w:bCs w:val="1"/>
-          <w:sz w:val="24"/>
-          <w:szCs w:val="24"/>
+        <w:rPr/>
+      </w:pPr>
+      <w:r>
+        <w:rPr>
+          <w:b w:val="1"/>
+          <w:bCs w:val="1"/>
           <w:rtl w:val="0"/>
         </w:rPr>
         <w:t xml:space="preserve">Освіта:</w:t>
       </w:r>
       <w:r>
         <w:rPr>
-          <w:sz w:val="24"/>
-          <w:szCs w:val="24"/>
           <w:rtl w:val="0"/>
         </w:rPr>
         <w:t xml:space="preserve"> Львівський національний медичний університет імені Данила Галицького, спеціальність педіатрія. 2011-2017р</w:t>
@@ -332,15 +273,10 @@
           <w:right w:color="auto" w:space="0" w:sz="0" w:val="none"/>
           <w:between w:color="auto" w:space="0" w:sz="0" w:val="none"/>
         </w:pBdr>
-        <w:rPr>
-          <w:sz w:val="24"/>
-          <w:szCs w:val="24"/>
-        </w:rPr>
-      </w:pPr>
-      <w:r>
-        <w:rPr>
-          <w:sz w:val="24"/>
-          <w:szCs w:val="24"/>
+        <w:rPr/>
+      </w:pPr>
+      <w:r>
+        <w:rPr>
           <w:rtl w:val="0"/>
         </w:rPr>
         <w:t xml:space="preserve">Стаж - 9 років.</w:t>
@@ -358,14 +294,10 @@
         <w:rPr>
           <w:b w:val="1"/>
           <w:bCs w:val="1"/>
-          <w:sz w:val="24"/>
-          <w:szCs w:val="24"/>
-        </w:rPr>
-      </w:pPr>
-      <w:r>
-        <w:rPr>
-          <w:sz w:val="24"/>
-          <w:szCs w:val="24"/>
+        </w:rPr>
+      </w:pPr>
+      <w:r>
+        <w:rPr>
           <w:rtl w:val="0"/>
         </w:rPr>
         <w:t xml:space="preserve">З 21.05.2026 отримала спеціальність  лікаря ультразвукової діагностики.</w:t>
@@ -387,17 +319,13 @@
         </w:pBdr>
         <w:rPr>
           <w:color w:val="2f2e2e"/>
-          <w:sz w:val="24"/>
-          <w:szCs w:val="24"/>
-        </w:rPr>
-      </w:pPr>
-      <w:r>
-        <w:rPr>
-          <w:b w:val="1"/>
-          <w:bCs w:val="1"/>
-          <w:color w:val="2f2e2e"/>
-          <w:sz w:val="24"/>
-          <w:szCs w:val="24"/>
+        </w:rPr>
+      </w:pPr>
+      <w:r>
+        <w:rPr>
+          <w:b w:val="1"/>
+          <w:bCs w:val="1"/>
+          <w:color w:val="2f2e2e"/>
           <w:rtl w:val="0"/>
         </w:rPr>
         <w:t xml:space="preserve">Локація:</w:t>
@@ -405,8 +333,6 @@
       <w:r>
         <w:rPr>
           <w:color w:val="2f2e2e"/>
-          <w:sz w:val="24"/>
-          <w:szCs w:val="24"/>
           <w:rtl w:val="0"/>
         </w:rPr>
         <w:t xml:space="preserve"> </w:t>
@@ -414,8 +340,6 @@
       <w:r>
         <w:rPr>
           <w:color w:val="2f2e2e"/>
-          <w:sz w:val="24"/>
-          <w:szCs w:val="24"/>
           <w:rtl w:val="0"/>
         </w:rPr>
         <w:t xml:space="preserve">м.Львів вул.Стрийська 86В</w:t>
@@ -432,29 +356,25 @@
         </w:pBdr>
         <w:rPr>
           <w:color w:val="2f2e2e"/>
-          <w:sz w:val="24"/>
-          <w:szCs w:val="24"/>
-        </w:rPr>
-      </w:pPr>
-      <w:r>
-        <w:rPr>
-          <w:rtl w:val="0"/>
-        </w:rPr>
-      </w:r>
-    </w:p>
-    <w:p>
-      <w:pPr>
-        <w:pBdr>
-          <w:top w:color="auto" w:space="0" w:sz="0" w:val="none"/>
-          <w:left w:color="auto" w:space="0" w:sz="0" w:val="none"/>
-          <w:bottom w:color="auto" w:space="0" w:sz="0" w:val="none"/>
-          <w:right w:color="auto" w:space="0" w:sz="0" w:val="none"/>
-          <w:between w:color="auto" w:space="0" w:sz="0" w:val="none"/>
-        </w:pBdr>
-        <w:rPr>
-          <w:color w:val="2f2e2e"/>
-          <w:sz w:val="24"/>
-          <w:szCs w:val="24"/>
+        </w:rPr>
+      </w:pPr>
+      <w:r>
+        <w:rPr>
+          <w:rtl w:val="0"/>
+        </w:rPr>
+      </w:r>
+    </w:p>
+    <w:p>
+      <w:pPr>
+        <w:pBdr>
+          <w:top w:color="auto" w:space="0" w:sz="0" w:val="none"/>
+          <w:left w:color="auto" w:space="0" w:sz="0" w:val="none"/>
+          <w:bottom w:color="auto" w:space="0" w:sz="0" w:val="none"/>
+          <w:right w:color="auto" w:space="0" w:sz="0" w:val="none"/>
+          <w:between w:color="auto" w:space="0" w:sz="0" w:val="none"/>
+        </w:pBdr>
+        <w:rPr>
+          <w:color w:val="2f2e2e"/>
         </w:rPr>
       </w:pPr>
       <w:r>
@@ -479,32 +399,26 @@
         </w:pBdr>
         <w:rPr>
           <w:color w:val="2f2e2e"/>
-          <w:sz w:val="24"/>
-          <w:szCs w:val="24"/>
-        </w:rPr>
-      </w:pPr>
-      <w:r>
-        <w:rPr>
-          <w:rtl w:val="0"/>
-        </w:rPr>
-      </w:r>
-    </w:p>
-    <w:p>
-      <w:pPr>
-        <w:rPr>
-          <w:b w:val="1"/>
-          <w:bCs w:val="1"/>
-          <w:color w:val="2f2e2e"/>
-          <w:sz w:val="24"/>
-          <w:szCs w:val="24"/>
-        </w:rPr>
-      </w:pPr>
-      <w:r>
-        <w:rPr>
-          <w:b w:val="1"/>
-          <w:bCs w:val="1"/>
-          <w:sz w:val="24"/>
-          <w:szCs w:val="24"/>
+        </w:rPr>
+      </w:pPr>
+      <w:r>
+        <w:rPr>
+          <w:rtl w:val="0"/>
+        </w:rPr>
+      </w:r>
+    </w:p>
+    <w:p>
+      <w:pPr>
+        <w:rPr>
+          <w:b w:val="1"/>
+          <w:bCs w:val="1"/>
+          <w:color w:val="2f2e2e"/>
+        </w:rPr>
+      </w:pPr>
+      <w:r>
+        <w:rPr>
+          <w:b w:val="1"/>
+          <w:bCs w:val="1"/>
           <w:rtl w:val="0"/>
         </w:rPr>
         <w:t xml:space="preserve">3. НАТАЛІЯ БІГУН - </w:t>
@@ -514,8 +428,6 @@
           <w:b w:val="1"/>
           <w:bCs w:val="1"/>
           <w:color w:val="1d1c1d"/>
-          <w:sz w:val="24"/>
-          <w:szCs w:val="24"/>
           <w:rtl w:val="0"/>
         </w:rPr>
         <w:t xml:space="preserve">сімейний лікар та лікар ультразвукової діагностики</w:t>
@@ -530,16 +442,12 @@
       <w:pPr>
         <w:rPr>
           <w:color w:val="1d1c1d"/>
-          <w:sz w:val="24"/>
-          <w:szCs w:val="24"/>
-        </w:rPr>
-      </w:pPr>
-      <w:r>
-        <w:rPr>
-          <w:b w:val="1"/>
-          <w:bCs w:val="1"/>
-          <w:sz w:val="24"/>
-          <w:szCs w:val="24"/>
+        </w:rPr>
+      </w:pPr>
+      <w:r>
+        <w:rPr>
+          <w:b w:val="1"/>
+          <w:bCs w:val="1"/>
           <w:rtl w:val="0"/>
         </w:rPr>
         <w:t xml:space="preserve">Чому обрала цю професію: </w:t>
@@ -547,8 +455,6 @@
       <w:r>
         <w:rPr>
           <w:color w:val="1d1c1d"/>
-          <w:sz w:val="24"/>
-          <w:szCs w:val="24"/>
           <w:rtl w:val="0"/>
         </w:rPr>
         <w:t xml:space="preserve">Особливе місце у моїй практиці займає здоров’я дітей, адже для мене важливо не лише допомогти дитині одужати, а й підтримати батьків, відповісти на їхні запитання та допомогти почуватися впевненіше щодо здоров’я своєї дитини. Люблю медицину за можливість постійно навчатися та професійно розвиватися. Поєднання сімейної медицини та ультразвукової діагностики допомагає мені комплексно оцінювати стан здоров’я пацієнта та визначати подальшу тактику діагностики й лікування. Працюю за принципами доказової медицини, поєднуючи уважне ставлення до пацієнта із сучасними підходами до діагностики та лікування. Вірю, що довіра, відкрите спілкування та партнерство між лікарем і родиною є основою якісної медичної допомоги.</w:t>
@@ -568,17 +474,13 @@
           <w:b w:val="1"/>
           <w:bCs w:val="1"/>
           <w:color w:val="1d1c1d"/>
-          <w:sz w:val="24"/>
-          <w:szCs w:val="24"/>
-        </w:rPr>
-      </w:pPr>
-      <w:r>
-        <w:rPr>
-          <w:b w:val="1"/>
-          <w:bCs w:val="1"/>
-          <w:color w:val="1d1c1d"/>
-          <w:sz w:val="24"/>
-          <w:szCs w:val="24"/>
+        </w:rPr>
+      </w:pPr>
+      <w:r>
+        <w:rPr>
+          <w:b w:val="1"/>
+          <w:bCs w:val="1"/>
+          <w:color w:val="1d1c1d"/>
           <w:rtl w:val="0"/>
         </w:rPr>
         <w:t xml:space="preserve">Напрями:</w:t>
@@ -596,15 +498,11 @@
         <w:spacing w:after="60" w:before="60" w:lineRule="auto"/>
         <w:rPr>
           <w:color w:val="1d1c1d"/>
-          <w:sz w:val="24"/>
-          <w:szCs w:val="24"/>
-        </w:rPr>
-      </w:pPr>
-      <w:r>
-        <w:rPr>
-          <w:color w:val="1d1c1d"/>
-          <w:sz w:val="24"/>
-          <w:szCs w:val="24"/>
+        </w:rPr>
+      </w:pPr>
+      <w:r>
+        <w:rPr>
+          <w:color w:val="1d1c1d"/>
           <w:rtl w:val="0"/>
         </w:rPr>
         <w:t xml:space="preserve">•Патронаж новонароджених</w:t>
@@ -622,15 +520,11 @@
         <w:spacing w:after="60" w:before="60" w:lineRule="auto"/>
         <w:rPr>
           <w:color w:val="1d1c1d"/>
-          <w:sz w:val="24"/>
-          <w:szCs w:val="24"/>
-        </w:rPr>
-      </w:pPr>
-      <w:r>
-        <w:rPr>
-          <w:color w:val="1d1c1d"/>
-          <w:sz w:val="24"/>
-          <w:szCs w:val="24"/>
+        </w:rPr>
+      </w:pPr>
+      <w:r>
+        <w:rPr>
+          <w:color w:val="1d1c1d"/>
           <w:rtl w:val="0"/>
         </w:rPr>
         <w:t xml:space="preserve">• Профілактичні огляди та супровід дітей та дорослих</w:t>
@@ -648,15 +542,11 @@
         <w:spacing w:after="60" w:before="60" w:lineRule="auto"/>
         <w:rPr>
           <w:color w:val="1d1c1d"/>
-          <w:sz w:val="24"/>
-          <w:szCs w:val="24"/>
-        </w:rPr>
-      </w:pPr>
-      <w:r>
-        <w:rPr>
-          <w:color w:val="1d1c1d"/>
-          <w:sz w:val="24"/>
-          <w:szCs w:val="24"/>
+        </w:rPr>
+      </w:pPr>
+      <w:r>
+        <w:rPr>
+          <w:color w:val="1d1c1d"/>
           <w:rtl w:val="0"/>
         </w:rPr>
         <w:t xml:space="preserve">• Консультації щодо вакцинації та складання індивідуальних графіків щеплень</w:t>
@@ -674,15 +564,11 @@
         <w:spacing w:after="60" w:before="60" w:lineRule="auto"/>
         <w:rPr>
           <w:color w:val="1d1c1d"/>
-          <w:sz w:val="24"/>
-          <w:szCs w:val="24"/>
-        </w:rPr>
-      </w:pPr>
-      <w:r>
-        <w:rPr>
-          <w:color w:val="1d1c1d"/>
-          <w:sz w:val="24"/>
-          <w:szCs w:val="24"/>
+        </w:rPr>
+      </w:pPr>
+      <w:r>
+        <w:rPr>
+          <w:color w:val="1d1c1d"/>
           <w:rtl w:val="0"/>
         </w:rPr>
         <w:t xml:space="preserve">• Огляд і лікування дітей та дорослих при захворюваннях</w:t>
@@ -700,15 +586,11 @@
         <w:spacing w:after="60" w:before="60" w:lineRule="auto"/>
         <w:rPr>
           <w:color w:val="1d1c1d"/>
-          <w:sz w:val="24"/>
-          <w:szCs w:val="24"/>
-        </w:rPr>
-      </w:pPr>
-      <w:r>
-        <w:rPr>
-          <w:color w:val="1d1c1d"/>
-          <w:sz w:val="24"/>
-          <w:szCs w:val="24"/>
+        </w:rPr>
+      </w:pPr>
+      <w:r>
+        <w:rPr>
+          <w:color w:val="1d1c1d"/>
           <w:rtl w:val="0"/>
         </w:rPr>
         <w:t xml:space="preserve">• Консультування з грудного вигодовування, розвитку та догляду за дитиною</w:t>
@@ -726,15 +608,11 @@
         <w:spacing w:after="60" w:before="60" w:lineRule="auto"/>
         <w:rPr>
           <w:color w:val="1d1c1d"/>
-          <w:sz w:val="24"/>
-          <w:szCs w:val="24"/>
-        </w:rPr>
-      </w:pPr>
-      <w:r>
-        <w:rPr>
-          <w:color w:val="1d1c1d"/>
-          <w:sz w:val="24"/>
-          <w:szCs w:val="24"/>
+        </w:rPr>
+      </w:pPr>
+      <w:r>
+        <w:rPr>
+          <w:color w:val="1d1c1d"/>
           <w:rtl w:val="0"/>
         </w:rPr>
         <w:t xml:space="preserve">• Розшифрування аналізів та результатів обстежень</w:t>
@@ -752,15 +630,11 @@
         <w:spacing w:after="60" w:before="60" w:lineRule="auto"/>
         <w:rPr>
           <w:color w:val="1d1c1d"/>
-          <w:sz w:val="24"/>
-          <w:szCs w:val="24"/>
-        </w:rPr>
-      </w:pPr>
-      <w:r>
-        <w:rPr>
-          <w:color w:val="1d1c1d"/>
-          <w:sz w:val="24"/>
-          <w:szCs w:val="24"/>
+        </w:rPr>
+      </w:pPr>
+      <w:r>
+        <w:rPr>
+          <w:color w:val="1d1c1d"/>
           <w:rtl w:val="0"/>
         </w:rPr>
         <w:t xml:space="preserve">• УЗД органів черевної порожнини та нирок</w:t>
@@ -778,15 +652,11 @@
         <w:spacing w:after="60" w:before="60" w:lineRule="auto"/>
         <w:rPr>
           <w:color w:val="1d1c1d"/>
-          <w:sz w:val="24"/>
-          <w:szCs w:val="24"/>
-        </w:rPr>
-      </w:pPr>
-      <w:r>
-        <w:rPr>
-          <w:color w:val="1d1c1d"/>
-          <w:sz w:val="24"/>
-          <w:szCs w:val="24"/>
+        </w:rPr>
+      </w:pPr>
+      <w:r>
+        <w:rPr>
+          <w:color w:val="1d1c1d"/>
           <w:rtl w:val="0"/>
         </w:rPr>
         <w:t xml:space="preserve">• УЗД щитоподібної та молочних залоз</w:t>
@@ -804,15 +674,11 @@
         <w:spacing w:after="60" w:before="60" w:lineRule="auto"/>
         <w:rPr>
           <w:color w:val="1d1c1d"/>
-          <w:sz w:val="24"/>
-          <w:szCs w:val="24"/>
-        </w:rPr>
-      </w:pPr>
-      <w:r>
-        <w:rPr>
-          <w:color w:val="1d1c1d"/>
-          <w:sz w:val="24"/>
-          <w:szCs w:val="24"/>
+        </w:rPr>
+      </w:pPr>
+      <w:r>
+        <w:rPr>
+          <w:color w:val="1d1c1d"/>
           <w:rtl w:val="0"/>
         </w:rPr>
         <w:t xml:space="preserve">• УЗД лімфатичних вузлів і м'яких тканин</w:t>
@@ -832,15 +698,11 @@
           <w:b w:val="1"/>
           <w:bCs w:val="1"/>
           <w:color w:val="2f2e2e"/>
-          <w:sz w:val="24"/>
-          <w:szCs w:val="24"/>
-        </w:rPr>
-      </w:pPr>
-      <w:r>
-        <w:rPr>
-          <w:color w:val="1d1c1d"/>
-          <w:sz w:val="24"/>
-          <w:szCs w:val="24"/>
+        </w:rPr>
+      </w:pPr>
+      <w:r>
+        <w:rPr>
+          <w:color w:val="1d1c1d"/>
           <w:rtl w:val="0"/>
         </w:rPr>
         <w:t xml:space="preserve">• УЗД кульшових суглобів у немовлят</w:t>
@@ -853,18 +715,13 @@
     </w:p>
     <w:p>
       <w:pPr>
-        <w:rPr>
-          <w:sz w:val="24"/>
-          <w:szCs w:val="24"/>
-        </w:rPr>
-      </w:pPr>
-      <w:r>
-        <w:rPr>
-          <w:b w:val="1"/>
-          <w:bCs w:val="1"/>
-          <w:color w:val="2f2e2e"/>
-          <w:sz w:val="24"/>
-          <w:szCs w:val="24"/>
+        <w:rPr/>
+      </w:pPr>
+      <w:r>
+        <w:rPr>
+          <w:b w:val="1"/>
+          <w:bCs w:val="1"/>
+          <w:color w:val="2f2e2e"/>
           <w:rtl w:val="0"/>
         </w:rPr>
         <w:t xml:space="preserve">Локація:</w:t>
@@ -872,8 +729,6 @@
       <w:r>
         <w:rPr>
           <w:color w:val="2f2e2e"/>
-          <w:sz w:val="24"/>
-          <w:szCs w:val="24"/>
           <w:rtl w:val="0"/>
         </w:rPr>
         <w:t xml:space="preserve">м.Львів, вул.Тичини 21 </w:t>
@@ -895,29 +750,25 @@
         </w:pBdr>
         <w:rPr>
           <w:color w:val="2f2e2e"/>
-          <w:sz w:val="24"/>
-          <w:szCs w:val="24"/>
-        </w:rPr>
-      </w:pPr>
-      <w:r>
-        <w:rPr>
-          <w:rtl w:val="0"/>
-        </w:rPr>
-      </w:r>
-    </w:p>
-    <w:p>
-      <w:pPr>
-        <w:pBdr>
-          <w:top w:color="auto" w:space="0" w:sz="0" w:val="none"/>
-          <w:left w:color="auto" w:space="0" w:sz="0" w:val="none"/>
-          <w:bottom w:color="auto" w:space="0" w:sz="0" w:val="none"/>
-          <w:right w:color="auto" w:space="0" w:sz="0" w:val="none"/>
-          <w:between w:color="auto" w:space="0" w:sz="0" w:val="none"/>
-        </w:pBdr>
-        <w:rPr>
-          <w:color w:val="2f2e2e"/>
-          <w:sz w:val="24"/>
-          <w:szCs w:val="24"/>
+        </w:rPr>
+      </w:pPr>
+      <w:r>
+        <w:rPr>
+          <w:rtl w:val="0"/>
+        </w:rPr>
+      </w:r>
+    </w:p>
+    <w:p>
+      <w:pPr>
+        <w:pBdr>
+          <w:top w:color="auto" w:space="0" w:sz="0" w:val="none"/>
+          <w:left w:color="auto" w:space="0" w:sz="0" w:val="none"/>
+          <w:bottom w:color="auto" w:space="0" w:sz="0" w:val="none"/>
+          <w:right w:color="auto" w:space="0" w:sz="0" w:val="none"/>
+          <w:between w:color="auto" w:space="0" w:sz="0" w:val="none"/>
+        </w:pBdr>
+        <w:rPr>
+          <w:color w:val="2f2e2e"/>
         </w:rPr>
       </w:pPr>
       <w:r>
@@ -942,32 +793,26 @@
         </w:pBdr>
         <w:rPr>
           <w:color w:val="2f2e2e"/>
-          <w:sz w:val="24"/>
-          <w:szCs w:val="24"/>
-        </w:rPr>
-      </w:pPr>
-      <w:r>
-        <w:rPr>
-          <w:rtl w:val="0"/>
-        </w:rPr>
-      </w:r>
-    </w:p>
-    <w:p>
-      <w:pPr>
-        <w:rPr>
-          <w:b w:val="1"/>
-          <w:bCs w:val="1"/>
-          <w:color w:val="2f2e2e"/>
-          <w:sz w:val="24"/>
-          <w:szCs w:val="24"/>
-        </w:rPr>
-      </w:pPr>
-      <w:r>
-        <w:rPr>
-          <w:b w:val="1"/>
-          <w:bCs w:val="1"/>
-          <w:sz w:val="24"/>
-          <w:szCs w:val="24"/>
+        </w:rPr>
+      </w:pPr>
+      <w:r>
+        <w:rPr>
+          <w:rtl w:val="0"/>
+        </w:rPr>
+      </w:r>
+    </w:p>
+    <w:p>
+      <w:pPr>
+        <w:rPr>
+          <w:b w:val="1"/>
+          <w:bCs w:val="1"/>
+          <w:color w:val="2f2e2e"/>
+        </w:rPr>
+      </w:pPr>
+      <w:r>
+        <w:rPr>
+          <w:b w:val="1"/>
+          <w:bCs w:val="1"/>
           <w:rtl w:val="0"/>
         </w:rPr>
         <w:t xml:space="preserve">4. ЛЕСЯ КОШЛАТА - </w:t>
@@ -977,8 +822,6 @@
           <w:b w:val="1"/>
           <w:bCs w:val="1"/>
           <w:color w:val="2f2e2e"/>
-          <w:sz w:val="24"/>
-          <w:szCs w:val="24"/>
           <w:rtl w:val="0"/>
         </w:rPr>
         <w:t xml:space="preserve">лікар-педіатр</w:t>
@@ -986,25 +829,18 @@
     </w:p>
     <w:p>
       <w:pPr>
-        <w:rPr>
-          <w:sz w:val="24"/>
-          <w:szCs w:val="24"/>
-        </w:rPr>
-      </w:pPr>
-      <w:r>
-        <w:rPr>
-          <w:b w:val="1"/>
-          <w:bCs w:val="1"/>
-          <w:sz w:val="24"/>
-          <w:szCs w:val="24"/>
+        <w:rPr/>
+      </w:pPr>
+      <w:r>
+        <w:rPr>
+          <w:b w:val="1"/>
+          <w:bCs w:val="1"/>
           <w:rtl w:val="0"/>
         </w:rPr>
         <w:t xml:space="preserve">Освіта:</w:t>
       </w:r>
       <w:r>
         <w:rPr>
-          <w:sz w:val="24"/>
-          <w:szCs w:val="24"/>
           <w:rtl w:val="0"/>
         </w:rPr>
         <w:t xml:space="preserve"> Львівський національний медичний університет імені Данила Галицького • Спеціальність: лікар-педіатр • Досвід роботи: 10+ років</w:t>
@@ -1012,25 +848,18 @@
     </w:p>
     <w:p>
       <w:pPr>
-        <w:rPr>
-          <w:sz w:val="24"/>
-          <w:szCs w:val="24"/>
-        </w:rPr>
-      </w:pPr>
-      <w:r>
-        <w:rPr>
-          <w:b w:val="1"/>
-          <w:bCs w:val="1"/>
-          <w:sz w:val="24"/>
-          <w:szCs w:val="24"/>
+        <w:rPr/>
+      </w:pPr>
+      <w:r>
+        <w:rPr>
+          <w:b w:val="1"/>
+          <w:bCs w:val="1"/>
           <w:rtl w:val="0"/>
         </w:rPr>
         <w:t xml:space="preserve">Чому обрала цю професію: </w:t>
       </w:r>
       <w:r>
         <w:rPr>
-          <w:sz w:val="24"/>
-          <w:szCs w:val="24"/>
           <w:rtl w:val="0"/>
         </w:rPr>
         <w:t xml:space="preserve">Я стала лікарем-педіатром, тому що щиро люблю працювати з дітьми та вірю, що здорове дитинство є найкращим фундаментом для щасливого майбутнього.</w:t>
@@ -1038,25 +867,18 @@
     </w:p>
     <w:p>
       <w:pPr>
-        <w:rPr>
-          <w:sz w:val="24"/>
-          <w:szCs w:val="24"/>
-        </w:rPr>
-      </w:pPr>
-      <w:r>
-        <w:rPr>
-          <w:b w:val="1"/>
-          <w:bCs w:val="1"/>
-          <w:sz w:val="24"/>
-          <w:szCs w:val="24"/>
+        <w:rPr/>
+      </w:pPr>
+      <w:r>
+        <w:rPr>
+          <w:b w:val="1"/>
+          <w:bCs w:val="1"/>
           <w:rtl w:val="0"/>
         </w:rPr>
         <w:t xml:space="preserve">Про себе:</w:t>
       </w:r>
       <w:r>
         <w:rPr>
-          <w:sz w:val="24"/>
-          <w:szCs w:val="24"/>
           <w:rtl w:val="0"/>
         </w:rPr>
         <w:t xml:space="preserve">Я лікар-педіатр із понад 10-річним досвідом роботи. У своїй практиці прагну бути не лише лікарем для дитини, а й надійним партнером для батьків. Для мене важливо, щоб кожна сім’я отримувала зрозумілі рекомендації, відчувала підтримку та впевненість у прийнятих рішеннях щодо здоров’я дитини. Працюю на засадах доказової медицини, уважно ставлюся до потреб маленьких пацієнтів і переконана, що довіра між лікарем та родиною є основою успішного лікування.</w:t>
@@ -1074,16 +896,12 @@
         <w:rPr>
           <w:b w:val="1"/>
           <w:bCs w:val="1"/>
-          <w:sz w:val="24"/>
-          <w:szCs w:val="24"/>
-        </w:rPr>
-      </w:pPr>
-      <w:r>
-        <w:rPr>
-          <w:b w:val="1"/>
-          <w:bCs w:val="1"/>
-          <w:sz w:val="24"/>
-          <w:szCs w:val="24"/>
+        </w:rPr>
+      </w:pPr>
+      <w:r>
+        <w:rPr>
+          <w:b w:val="1"/>
+          <w:bCs w:val="1"/>
           <w:rtl w:val="0"/>
         </w:rPr>
         <w:t xml:space="preserve">Напрями роботи:</w:t>
@@ -1098,15 +916,10 @@
           <w:right w:color="auto" w:space="0" w:sz="0" w:val="none"/>
           <w:between w:color="auto" w:space="0" w:sz="0" w:val="none"/>
         </w:pBdr>
-        <w:rPr>
-          <w:sz w:val="24"/>
-          <w:szCs w:val="24"/>
-        </w:rPr>
-      </w:pPr>
-      <w:r>
-        <w:rPr>
-          <w:sz w:val="24"/>
-          <w:szCs w:val="24"/>
+        <w:rPr/>
+      </w:pPr>
+      <w:r>
+        <w:rPr>
           <w:rtl w:val="0"/>
         </w:rPr>
         <w:t xml:space="preserve">• Профілактичні огляди дітей від народження до 18 років</w:t>
@@ -1121,15 +934,10 @@
           <w:right w:color="auto" w:space="0" w:sz="0" w:val="none"/>
           <w:between w:color="auto" w:space="0" w:sz="0" w:val="none"/>
         </w:pBdr>
-        <w:rPr>
-          <w:sz w:val="24"/>
-          <w:szCs w:val="24"/>
-        </w:rPr>
-      </w:pPr>
-      <w:r>
-        <w:rPr>
-          <w:sz w:val="24"/>
-          <w:szCs w:val="24"/>
+        <w:rPr/>
+      </w:pPr>
+      <w:r>
+        <w:rPr>
           <w:rtl w:val="0"/>
         </w:rPr>
         <w:t xml:space="preserve">• Діагностика та лікування дитячих захворювань</w:t>
@@ -1144,15 +952,10 @@
           <w:right w:color="auto" w:space="0" w:sz="0" w:val="none"/>
           <w:between w:color="auto" w:space="0" w:sz="0" w:val="none"/>
         </w:pBdr>
-        <w:rPr>
-          <w:sz w:val="24"/>
-          <w:szCs w:val="24"/>
-        </w:rPr>
-      </w:pPr>
-      <w:r>
-        <w:rPr>
-          <w:sz w:val="24"/>
-          <w:szCs w:val="24"/>
+        <w:rPr/>
+      </w:pPr>
+      <w:r>
+        <w:rPr>
           <w:rtl w:val="0"/>
         </w:rPr>
         <w:t xml:space="preserve">• Вакцинація згідно з сучасними рекомендаціями</w:t>
@@ -1167,15 +970,10 @@
           <w:right w:color="auto" w:space="0" w:sz="0" w:val="none"/>
           <w:between w:color="auto" w:space="0" w:sz="0" w:val="none"/>
         </w:pBdr>
-        <w:rPr>
-          <w:sz w:val="24"/>
-          <w:szCs w:val="24"/>
-        </w:rPr>
-      </w:pPr>
-      <w:r>
-        <w:rPr>
-          <w:sz w:val="24"/>
-          <w:szCs w:val="24"/>
+        <w:rPr/>
+      </w:pPr>
+      <w:r>
+        <w:rPr>
           <w:rtl w:val="0"/>
         </w:rPr>
         <w:t xml:space="preserve">• Консультування щодо розвитку та догляду за дитиною</w:t>
@@ -1187,14 +985,10 @@
           <w:b w:val="1"/>
           <w:bCs w:val="1"/>
           <w:color w:val="2f2e2e"/>
-          <w:sz w:val="24"/>
-          <w:szCs w:val="24"/>
-        </w:rPr>
-      </w:pPr>
-      <w:r>
-        <w:rPr>
-          <w:sz w:val="24"/>
-          <w:szCs w:val="24"/>
+        </w:rPr>
+      </w:pPr>
+      <w:r>
+        <w:rPr>
           <w:rtl w:val="0"/>
         </w:rPr>
         <w:t xml:space="preserve">• Супровід дітей із гострими та хронічними захворюваннями</w:t>
@@ -1203,8 +997,6 @@
         <w:rPr>
           <w:b w:val="1"/>
           <w:bCs w:val="1"/>
-          <w:sz w:val="24"/>
-          <w:szCs w:val="24"/>
           <w:rtl w:val="0"/>
         </w:rPr>
         <w:t xml:space="preserve"> </w:t>
@@ -1219,17 +1011,13 @@
       <w:pPr>
         <w:rPr>
           <w:color w:val="2f2e2e"/>
-          <w:sz w:val="24"/>
-          <w:szCs w:val="24"/>
-        </w:rPr>
-      </w:pPr>
-      <w:r>
-        <w:rPr>
-          <w:b w:val="1"/>
-          <w:bCs w:val="1"/>
-          <w:color w:val="2f2e2e"/>
-          <w:sz w:val="24"/>
-          <w:szCs w:val="24"/>
+        </w:rPr>
+      </w:pPr>
+      <w:r>
+        <w:rPr>
+          <w:b w:val="1"/>
+          <w:bCs w:val="1"/>
+          <w:color w:val="2f2e2e"/>
           <w:rtl w:val="0"/>
         </w:rPr>
         <w:t xml:space="preserve">Локація</w:t>
@@ -1237,8 +1025,6 @@
       <w:r>
         <w:rPr>
           <w:color w:val="2f2e2e"/>
-          <w:sz w:val="24"/>
-          <w:szCs w:val="24"/>
           <w:rtl w:val="0"/>
         </w:rPr>
         <w:t xml:space="preserve"> м.Львів вул.Стрийська 86В</w:t>
@@ -1256,30 +1042,26 @@
         <w:rPr>
           <w:b w:val="1"/>
           <w:bCs w:val="1"/>
-          <w:sz w:val="24"/>
-          <w:szCs w:val="24"/>
-        </w:rPr>
-      </w:pPr>
-      <w:r>
-        <w:rPr>
-          <w:rtl w:val="0"/>
-        </w:rPr>
-      </w:r>
-    </w:p>
-    <w:p>
-      <w:pPr>
-        <w:pBdr>
-          <w:top w:color="auto" w:space="0" w:sz="0" w:val="none"/>
-          <w:left w:color="auto" w:space="0" w:sz="0" w:val="none"/>
-          <w:bottom w:color="auto" w:space="0" w:sz="0" w:val="none"/>
-          <w:right w:color="auto" w:space="0" w:sz="0" w:val="none"/>
-          <w:between w:color="auto" w:space="0" w:sz="0" w:val="none"/>
-        </w:pBdr>
-        <w:rPr>
-          <w:b w:val="1"/>
-          <w:bCs w:val="1"/>
-          <w:sz w:val="24"/>
-          <w:szCs w:val="24"/>
+        </w:rPr>
+      </w:pPr>
+      <w:r>
+        <w:rPr>
+          <w:rtl w:val="0"/>
+        </w:rPr>
+      </w:r>
+    </w:p>
+    <w:p>
+      <w:pPr>
+        <w:pBdr>
+          <w:top w:color="auto" w:space="0" w:sz="0" w:val="none"/>
+          <w:left w:color="auto" w:space="0" w:sz="0" w:val="none"/>
+          <w:bottom w:color="auto" w:space="0" w:sz="0" w:val="none"/>
+          <w:right w:color="auto" w:space="0" w:sz="0" w:val="none"/>
+          <w:between w:color="auto" w:space="0" w:sz="0" w:val="none"/>
+        </w:pBdr>
+        <w:rPr>
+          <w:b w:val="1"/>
+          <w:bCs w:val="1"/>
         </w:rPr>
       </w:pPr>
       <w:r>
@@ -1304,32 +1086,26 @@
         </w:pBdr>
         <w:rPr>
           <w:color w:val="2f2e2e"/>
-          <w:sz w:val="24"/>
-          <w:szCs w:val="24"/>
-        </w:rPr>
-      </w:pPr>
-      <w:r>
-        <w:rPr>
-          <w:rtl w:val="0"/>
-        </w:rPr>
-      </w:r>
-    </w:p>
-    <w:p>
-      <w:pPr>
-        <w:rPr>
-          <w:b w:val="1"/>
-          <w:bCs w:val="1"/>
-          <w:color w:val="2f2e2e"/>
-          <w:sz w:val="24"/>
-          <w:szCs w:val="24"/>
-        </w:rPr>
-      </w:pPr>
-      <w:r>
-        <w:rPr>
-          <w:b w:val="1"/>
-          <w:bCs w:val="1"/>
-          <w:sz w:val="24"/>
-          <w:szCs w:val="24"/>
+        </w:rPr>
+      </w:pPr>
+      <w:r>
+        <w:rPr>
+          <w:rtl w:val="0"/>
+        </w:rPr>
+      </w:r>
+    </w:p>
+    <w:p>
+      <w:pPr>
+        <w:rPr>
+          <w:b w:val="1"/>
+          <w:bCs w:val="1"/>
+          <w:color w:val="2f2e2e"/>
+        </w:rPr>
+      </w:pPr>
+      <w:r>
+        <w:rPr>
+          <w:b w:val="1"/>
+          <w:bCs w:val="1"/>
           <w:rtl w:val="0"/>
         </w:rPr>
         <w:t xml:space="preserve">5. ОЛЬГА МИРОНЕЦЬ - </w:t>
@@ -1339,8 +1115,6 @@
           <w:b w:val="1"/>
           <w:bCs w:val="1"/>
           <w:color w:val="2f2e2e"/>
-          <w:sz w:val="24"/>
-          <w:szCs w:val="24"/>
           <w:rtl w:val="0"/>
         </w:rPr>
         <w:t xml:space="preserve">сімейна лікарка</w:t>
@@ -1348,25 +1122,18 @@
     </w:p>
     <w:p>
       <w:pPr>
-        <w:rPr>
-          <w:sz w:val="24"/>
-          <w:szCs w:val="24"/>
-        </w:rPr>
-      </w:pPr>
-      <w:r>
-        <w:rPr>
-          <w:b w:val="1"/>
-          <w:bCs w:val="1"/>
-          <w:sz w:val="24"/>
-          <w:szCs w:val="24"/>
+        <w:rPr/>
+      </w:pPr>
+      <w:r>
+        <w:rPr>
+          <w:b w:val="1"/>
+          <w:bCs w:val="1"/>
           <w:rtl w:val="0"/>
         </w:rPr>
         <w:t xml:space="preserve">Освіта:</w:t>
       </w:r>
       <w:r>
         <w:rPr>
-          <w:sz w:val="24"/>
-          <w:szCs w:val="24"/>
           <w:rtl w:val="0"/>
         </w:rPr>
         <w:t xml:space="preserve"> ЛНМУ ім. Данила Галицького 2006-2012 роки - за спеціальністю педіатрія</w:t>
@@ -1381,15 +1148,10 @@
           <w:right w:color="auto" w:space="0" w:sz="0" w:val="none"/>
           <w:between w:color="auto" w:space="0" w:sz="0" w:val="none"/>
         </w:pBdr>
-        <w:rPr>
-          <w:sz w:val="24"/>
-          <w:szCs w:val="24"/>
-        </w:rPr>
-      </w:pPr>
-      <w:r>
-        <w:rPr>
-          <w:sz w:val="24"/>
-          <w:szCs w:val="24"/>
+        <w:rPr/>
+      </w:pPr>
+      <w:r>
+        <w:rPr>
           <w:rtl w:val="0"/>
         </w:rPr>
         <w:t xml:space="preserve">2012-2014 - інтернатура на базі ЗУСДМЦ</w:t>
@@ -1404,15 +1166,10 @@
           <w:right w:color="auto" w:space="0" w:sz="0" w:val="none"/>
           <w:between w:color="auto" w:space="0" w:sz="0" w:val="none"/>
         </w:pBdr>
-        <w:rPr>
-          <w:sz w:val="24"/>
-          <w:szCs w:val="24"/>
-        </w:rPr>
-      </w:pPr>
-      <w:r>
-        <w:rPr>
-          <w:sz w:val="24"/>
-          <w:szCs w:val="24"/>
+        <w:rPr/>
+      </w:pPr>
+      <w:r>
+        <w:rPr>
           <w:rtl w:val="0"/>
         </w:rPr>
         <w:t xml:space="preserve">2023 - спеціалізація "загальна практика - сімейна медицина"</w:t>
@@ -1427,15 +1184,10 @@
           <w:right w:color="auto" w:space="0" w:sz="0" w:val="none"/>
           <w:between w:color="auto" w:space="0" w:sz="0" w:val="none"/>
         </w:pBdr>
-        <w:rPr>
-          <w:sz w:val="24"/>
-          <w:szCs w:val="24"/>
-        </w:rPr>
-      </w:pPr>
-      <w:r>
-        <w:rPr>
-          <w:sz w:val="24"/>
-          <w:szCs w:val="24"/>
+        <w:rPr/>
+      </w:pPr>
+      <w:r>
+        <w:rPr>
           <w:rtl w:val="0"/>
         </w:rPr>
         <w:t xml:space="preserve">Досвід роботи лікарем 10+ років</w:t>
@@ -1443,25 +1195,18 @@
     </w:p>
     <w:p>
       <w:pPr>
-        <w:rPr>
-          <w:sz w:val="24"/>
-          <w:szCs w:val="24"/>
-        </w:rPr>
-      </w:pPr>
-      <w:r>
-        <w:rPr>
-          <w:b w:val="1"/>
-          <w:bCs w:val="1"/>
-          <w:sz w:val="24"/>
-          <w:szCs w:val="24"/>
+        <w:rPr/>
+      </w:pPr>
+      <w:r>
+        <w:rPr>
+          <w:b w:val="1"/>
+          <w:bCs w:val="1"/>
           <w:rtl w:val="0"/>
         </w:rPr>
         <w:t xml:space="preserve">Чому обрала цю професію:</w:t>
       </w:r>
       <w:r>
         <w:rPr>
-          <w:sz w:val="24"/>
-          <w:szCs w:val="24"/>
           <w:rtl w:val="0"/>
         </w:rPr>
         <w:t xml:space="preserve">мені завжди було цікаво пізнавати як функціонує організм та чому розвиваються хвороби, як лікувати чи запобігти їх розвитку.</w:t>
@@ -1471,24 +1216,18 @@
       <w:pPr>
         <w:rPr>
           <w:color w:val="2f2e2e"/>
-          <w:sz w:val="24"/>
-          <w:szCs w:val="24"/>
-        </w:rPr>
-      </w:pPr>
-      <w:r>
-        <w:rPr>
-          <w:b w:val="1"/>
-          <w:bCs w:val="1"/>
-          <w:sz w:val="24"/>
-          <w:szCs w:val="24"/>
+        </w:rPr>
+      </w:pPr>
+      <w:r>
+        <w:rPr>
+          <w:b w:val="1"/>
+          <w:bCs w:val="1"/>
           <w:rtl w:val="0"/>
         </w:rPr>
         <w:t xml:space="preserve">Про себе:</w:t>
       </w:r>
       <w:r>
         <w:rPr>
-          <w:sz w:val="24"/>
-          <w:szCs w:val="24"/>
           <w:rtl w:val="0"/>
         </w:rPr>
         <w:t xml:space="preserve">люблю просте спілкування, ставлюся з повагою до усіх пацієнтів, ціную особистий простір</w:t>
@@ -1510,24 +1249,18 @@
         </w:pBdr>
         <w:rPr>
           <w:color w:val="2f2e2e"/>
-          <w:sz w:val="24"/>
-          <w:szCs w:val="24"/>
-        </w:rPr>
-      </w:pPr>
-      <w:r>
-        <w:rPr>
-          <w:b w:val="1"/>
-          <w:bCs w:val="1"/>
-          <w:sz w:val="24"/>
-          <w:szCs w:val="24"/>
+        </w:rPr>
+      </w:pPr>
+      <w:r>
+        <w:rPr>
+          <w:b w:val="1"/>
+          <w:bCs w:val="1"/>
           <w:rtl w:val="0"/>
         </w:rPr>
         <w:t xml:space="preserve">Напрямки роботи:</w:t>
       </w:r>
       <w:r>
         <w:rPr>
-          <w:sz w:val="24"/>
-          <w:szCs w:val="24"/>
           <w:rtl w:val="0"/>
         </w:rPr>
         <w:t xml:space="preserve"> сімейна медицина, педіатрія</w:t>
@@ -1542,17 +1275,13 @@
       <w:pPr>
         <w:rPr>
           <w:color w:val="2f2e2e"/>
-          <w:sz w:val="24"/>
-          <w:szCs w:val="24"/>
-        </w:rPr>
-      </w:pPr>
-      <w:r>
-        <w:rPr>
-          <w:b w:val="1"/>
-          <w:bCs w:val="1"/>
-          <w:color w:val="2f2e2e"/>
-          <w:sz w:val="24"/>
-          <w:szCs w:val="24"/>
+        </w:rPr>
+      </w:pPr>
+      <w:r>
+        <w:rPr>
+          <w:b w:val="1"/>
+          <w:bCs w:val="1"/>
+          <w:color w:val="2f2e2e"/>
           <w:rtl w:val="0"/>
         </w:rPr>
         <w:t xml:space="preserve">Локація</w:t>
@@ -1560,8 +1289,6 @@
       <w:r>
         <w:rPr>
           <w:color w:val="2f2e2e"/>
-          <w:sz w:val="24"/>
-          <w:szCs w:val="24"/>
           <w:rtl w:val="0"/>
         </w:rPr>
         <w:t xml:space="preserve"> м.Львів вул.Стрийська 86В</w:t>
@@ -1625,32 +1352,26 @@
         </w:pBdr>
         <w:rPr>
           <w:color w:val="2f2e2e"/>
-          <w:sz w:val="24"/>
-          <w:szCs w:val="24"/>
-        </w:rPr>
-      </w:pPr>
-      <w:r>
-        <w:rPr>
-          <w:rtl w:val="0"/>
-        </w:rPr>
-      </w:r>
-    </w:p>
-    <w:p>
-      <w:pPr>
-        <w:rPr>
-          <w:b w:val="1"/>
-          <w:bCs w:val="1"/>
-          <w:color w:val="2f2e2e"/>
-          <w:sz w:val="24"/>
-          <w:szCs w:val="24"/>
-        </w:rPr>
-      </w:pPr>
-      <w:r>
-        <w:rPr>
-          <w:b w:val="1"/>
-          <w:bCs w:val="1"/>
-          <w:sz w:val="24"/>
-          <w:szCs w:val="24"/>
+        </w:rPr>
+      </w:pPr>
+      <w:r>
+        <w:rPr>
+          <w:rtl w:val="0"/>
+        </w:rPr>
+      </w:r>
+    </w:p>
+    <w:p>
+      <w:pPr>
+        <w:rPr>
+          <w:b w:val="1"/>
+          <w:bCs w:val="1"/>
+          <w:color w:val="2f2e2e"/>
+        </w:rPr>
+      </w:pPr>
+      <w:r>
+        <w:rPr>
+          <w:b w:val="1"/>
+          <w:bCs w:val="1"/>
           <w:rtl w:val="0"/>
         </w:rPr>
         <w:t xml:space="preserve">6. ХРИСТИНА КОБРИН - </w:t>
@@ -1660,8 +1381,6 @@
           <w:b w:val="1"/>
           <w:bCs w:val="1"/>
           <w:color w:val="2f2e2e"/>
-          <w:sz w:val="24"/>
-          <w:szCs w:val="24"/>
           <w:rtl w:val="0"/>
         </w:rPr>
         <w:t xml:space="preserve">лікар-педіатр, консультантка з грудного вигодовування</w:t>
@@ -1669,25 +1388,18 @@
     </w:p>
     <w:p>
       <w:pPr>
-        <w:rPr>
-          <w:sz w:val="24"/>
-          <w:szCs w:val="24"/>
-        </w:rPr>
-      </w:pPr>
-      <w:r>
-        <w:rPr>
-          <w:b w:val="1"/>
-          <w:bCs w:val="1"/>
-          <w:sz w:val="24"/>
-          <w:szCs w:val="24"/>
+        <w:rPr/>
+      </w:pPr>
+      <w:r>
+        <w:rPr>
+          <w:b w:val="1"/>
+          <w:bCs w:val="1"/>
           <w:rtl w:val="0"/>
         </w:rPr>
         <w:t xml:space="preserve">Освіта:</w:t>
       </w:r>
       <w:r>
         <w:rPr>
-          <w:sz w:val="24"/>
-          <w:szCs w:val="24"/>
           <w:rtl w:val="0"/>
         </w:rPr>
         <w:t xml:space="preserve"> </w:t>
@@ -1695,16 +1407,12 @@
       <w:r>
         <w:rPr>
           <w:color w:val="1d1c1d"/>
-          <w:sz w:val="24"/>
-          <w:szCs w:val="24"/>
           <w:rtl w:val="0"/>
         </w:rPr>
         <w:t xml:space="preserve">ЛНМУ ім. Данила Галицького , лікар-педіатр, стаж- 4 роки</w:t>
       </w:r>
       <w:r>
         <w:rPr>
-          <w:sz w:val="24"/>
-          <w:szCs w:val="24"/>
           <w:rtl w:val="0"/>
         </w:rPr>
         <w:t xml:space="preserve">Л</w:t>
@@ -1714,16 +1422,12 @@
       <w:pPr>
         <w:rPr>
           <w:color w:val="1d1c1d"/>
-          <w:sz w:val="24"/>
-          <w:szCs w:val="24"/>
-        </w:rPr>
-      </w:pPr>
-      <w:r>
-        <w:rPr>
-          <w:b w:val="1"/>
-          <w:bCs w:val="1"/>
-          <w:sz w:val="24"/>
-          <w:szCs w:val="24"/>
+        </w:rPr>
+      </w:pPr>
+      <w:r>
+        <w:rPr>
+          <w:b w:val="1"/>
+          <w:bCs w:val="1"/>
           <w:rtl w:val="0"/>
         </w:rPr>
         <w:t xml:space="preserve">Чому обрала цю професію:</w:t>
@@ -1731,8 +1435,6 @@
       <w:r>
         <w:rPr>
           <w:color w:val="1d1c1d"/>
-          <w:sz w:val="24"/>
-          <w:szCs w:val="24"/>
           <w:rtl w:val="0"/>
         </w:rPr>
         <w:t xml:space="preserve">Я стала дитячою лікаркою, бо люблю спостерігати як дітки ростуть, розвиваються і хочу допомагати їм, щоб вони менше хворіли.</w:t>
@@ -1741,8 +1443,6 @@
         <w:rPr>
           <w:b w:val="1"/>
           <w:bCs w:val="1"/>
-          <w:sz w:val="24"/>
-          <w:szCs w:val="24"/>
           <w:rtl w:val="0"/>
         </w:rPr>
         <w:t xml:space="preserve"> Про себе: </w:t>
@@ -1750,8 +1450,6 @@
       <w:r>
         <w:rPr>
           <w:color w:val="1d1c1d"/>
-          <w:sz w:val="24"/>
-          <w:szCs w:val="24"/>
           <w:rtl w:val="0"/>
         </w:rPr>
         <w:t xml:space="preserve">Безмежно рада, що працюю з дітками і маю можливість допомогти нашим маленьким українцям та українкам мати міцне здоров'я, щоб в майбутньому розвивати нашу велику та незалежну Україну. </w:t>
@@ -1759,16 +1457,11 @@
     </w:p>
     <w:p>
       <w:pPr>
-        <w:rPr>
-          <w:sz w:val="24"/>
-          <w:szCs w:val="24"/>
-        </w:rPr>
-      </w:pPr>
-      <w:r>
-        <w:rPr>
-          <w:color w:val="1d1c1d"/>
-          <w:sz w:val="24"/>
-          <w:szCs w:val="24"/>
+        <w:rPr/>
+      </w:pPr>
+      <w:r>
+        <w:rPr>
+          <w:color w:val="1d1c1d"/>
           <w:rtl w:val="0"/>
         </w:rPr>
         <w:t xml:space="preserve">Я постійно навчаюсь і удосконалюю свої знання, щоб могти ще краще і якісніше надавати допомогу.  Стараюсь знайти підхід до кожного малюсика, щоб огляд не був стресовий. Хочу подарувати батькам хоч трошки впевненості і підтримки у нелегкому зростанні і виховуванні діток. </w:t>
@@ -1783,16 +1476,12 @@
       <w:pPr>
         <w:rPr>
           <w:color w:val="1d1c1d"/>
-          <w:sz w:val="24"/>
-          <w:szCs w:val="24"/>
-        </w:rPr>
-      </w:pPr>
-      <w:r>
-        <w:rPr>
-          <w:b w:val="1"/>
-          <w:bCs w:val="1"/>
-          <w:sz w:val="24"/>
-          <w:szCs w:val="24"/>
+        </w:rPr>
+      </w:pPr>
+      <w:r>
+        <w:rPr>
+          <w:b w:val="1"/>
+          <w:bCs w:val="1"/>
           <w:rtl w:val="0"/>
         </w:rPr>
         <w:t xml:space="preserve">Напрями роботи:</w:t>
@@ -1800,8 +1489,6 @@
       <w:r>
         <w:rPr>
           <w:color w:val="1d1c1d"/>
-          <w:sz w:val="24"/>
-          <w:szCs w:val="24"/>
           <w:rtl w:val="0"/>
         </w:rPr>
         <w:t xml:space="preserve"> Я є  консультантом з питань ГВ і вважаю, що грудне вигодовування- це найцінніше, що може дати кожна мама своєму малюку і можу вам допомогти справитись з труднощами, які виникають в процесі його налагодження та завершення. </w:t>
@@ -1821,15 +1508,11 @@
           <w:b w:val="1"/>
           <w:bCs w:val="1"/>
           <w:color w:val="2f2e2e"/>
-          <w:sz w:val="24"/>
-          <w:szCs w:val="24"/>
-        </w:rPr>
-      </w:pPr>
-      <w:r>
-        <w:rPr>
-          <w:color w:val="1d1c1d"/>
-          <w:sz w:val="24"/>
-          <w:szCs w:val="24"/>
+        </w:rPr>
+      </w:pPr>
+      <w:r>
+        <w:rPr>
+          <w:color w:val="1d1c1d"/>
           <w:rtl w:val="0"/>
         </w:rPr>
         <w:t xml:space="preserve">Також складаю локальні протоколи для лікарів Вулика, щоб усі у Вулику діяли згідно одного алгоритму.</w:t>
@@ -1842,18 +1525,13 @@
     </w:p>
     <w:p>
       <w:pPr>
-        <w:rPr>
-          <w:sz w:val="24"/>
-          <w:szCs w:val="24"/>
-        </w:rPr>
-      </w:pPr>
-      <w:r>
-        <w:rPr>
-          <w:b w:val="1"/>
-          <w:bCs w:val="1"/>
-          <w:color w:val="2f2e2e"/>
-          <w:sz w:val="24"/>
-          <w:szCs w:val="24"/>
+        <w:rPr/>
+      </w:pPr>
+      <w:r>
+        <w:rPr>
+          <w:b w:val="1"/>
+          <w:bCs w:val="1"/>
+          <w:color w:val="2f2e2e"/>
           <w:rtl w:val="0"/>
         </w:rPr>
         <w:t xml:space="preserve">Локація:</w:t>
@@ -1861,8 +1539,6 @@
       <w:r>
         <w:rPr>
           <w:color w:val="2f2e2e"/>
-          <w:sz w:val="24"/>
-          <w:szCs w:val="24"/>
           <w:rtl w:val="0"/>
         </w:rPr>
         <w:t xml:space="preserve"> м.Львів, вул.Тичини 21 </w:t>
@@ -1877,22 +1553,18 @@
       <w:pPr>
         <w:rPr>
           <w:color w:val="2f2e2e"/>
-          <w:sz w:val="24"/>
-          <w:szCs w:val="24"/>
-        </w:rPr>
-      </w:pPr>
-      <w:r>
-        <w:rPr>
-          <w:rtl w:val="0"/>
-        </w:rPr>
-      </w:r>
-    </w:p>
-    <w:p>
-      <w:pPr>
-        <w:rPr>
-          <w:color w:val="2f2e2e"/>
-          <w:sz w:val="24"/>
-          <w:szCs w:val="24"/>
+        </w:rPr>
+      </w:pPr>
+      <w:r>
+        <w:rPr>
+          <w:rtl w:val="0"/>
+        </w:rPr>
+      </w:r>
+    </w:p>
+    <w:p>
+      <w:pPr>
+        <w:rPr>
+          <w:color w:val="2f2e2e"/>
         </w:rPr>
       </w:pPr>
       <w:r>
@@ -1910,32 +1582,26 @@
       <w:pPr>
         <w:rPr>
           <w:color w:val="2f2e2e"/>
-          <w:sz w:val="24"/>
-          <w:szCs w:val="24"/>
-        </w:rPr>
-      </w:pPr>
-      <w:r>
-        <w:rPr>
-          <w:rtl w:val="0"/>
-        </w:rPr>
-      </w:r>
-    </w:p>
-    <w:p>
-      <w:pPr>
-        <w:rPr>
-          <w:b w:val="1"/>
-          <w:bCs w:val="1"/>
-          <w:color w:val="2f2e2e"/>
-          <w:sz w:val="24"/>
-          <w:szCs w:val="24"/>
-        </w:rPr>
-      </w:pPr>
-      <w:r>
-        <w:rPr>
-          <w:b w:val="1"/>
-          <w:bCs w:val="1"/>
-          <w:sz w:val="24"/>
-          <w:szCs w:val="24"/>
+        </w:rPr>
+      </w:pPr>
+      <w:r>
+        <w:rPr>
+          <w:rtl w:val="0"/>
+        </w:rPr>
+      </w:r>
+    </w:p>
+    <w:p>
+      <w:pPr>
+        <w:rPr>
+          <w:b w:val="1"/>
+          <w:bCs w:val="1"/>
+          <w:color w:val="2f2e2e"/>
+        </w:rPr>
+      </w:pPr>
+      <w:r>
+        <w:rPr>
+          <w:b w:val="1"/>
+          <w:bCs w:val="1"/>
           <w:rtl w:val="0"/>
         </w:rPr>
         <w:t xml:space="preserve">7. ОКСАНА КУРИЛЕЦЬ - </w:t>
@@ -1945,8 +1611,6 @@
           <w:b w:val="1"/>
           <w:bCs w:val="1"/>
           <w:color w:val="2f2e2e"/>
-          <w:sz w:val="24"/>
-          <w:szCs w:val="24"/>
           <w:rtl w:val="0"/>
         </w:rPr>
         <w:t xml:space="preserve">сімейна лікарка</w:t>
@@ -1956,24 +1620,18 @@
       <w:pPr>
         <w:rPr>
           <w:color w:val="1d1c1d"/>
-          <w:sz w:val="24"/>
-          <w:szCs w:val="24"/>
-        </w:rPr>
-      </w:pPr>
-      <w:r>
-        <w:rPr>
-          <w:b w:val="1"/>
-          <w:bCs w:val="1"/>
-          <w:sz w:val="24"/>
-          <w:szCs w:val="24"/>
+        </w:rPr>
+      </w:pPr>
+      <w:r>
+        <w:rPr>
+          <w:b w:val="1"/>
+          <w:bCs w:val="1"/>
           <w:rtl w:val="0"/>
         </w:rPr>
         <w:t xml:space="preserve">Освіта:</w:t>
       </w:r>
       <w:r>
         <w:rPr>
-          <w:sz w:val="24"/>
-          <w:szCs w:val="24"/>
           <w:rtl w:val="0"/>
         </w:rPr>
         <w:t xml:space="preserve"> </w:t>
@@ -1981,8 +1639,6 @@
       <w:r>
         <w:rPr>
           <w:color w:val="1d1c1d"/>
-          <w:sz w:val="24"/>
-          <w:szCs w:val="24"/>
           <w:rtl w:val="0"/>
         </w:rPr>
         <w:t xml:space="preserve"> ЛНМУ ім. Данила Галицького — спеціальність «Педіатрія»; 2023 р. — спеціалізація «Сімейна медицина», Сімейний лікар, Стаж 10+ років</w:t>
@@ -1992,16 +1648,12 @@
       <w:pPr>
         <w:rPr>
           <w:color w:val="1d1c1d"/>
-          <w:sz w:val="24"/>
-          <w:szCs w:val="24"/>
-        </w:rPr>
-      </w:pPr>
-      <w:r>
-        <w:rPr>
-          <w:b w:val="1"/>
-          <w:bCs w:val="1"/>
-          <w:sz w:val="24"/>
-          <w:szCs w:val="24"/>
+        </w:rPr>
+      </w:pPr>
+      <w:r>
+        <w:rPr>
+          <w:b w:val="1"/>
+          <w:bCs w:val="1"/>
           <w:rtl w:val="0"/>
         </w:rPr>
         <w:t xml:space="preserve">Чому обрала цю професію:</w:t>
@@ -2009,8 +1661,6 @@
       <w:r>
         <w:rPr>
           <w:color w:val="1d1c1d"/>
-          <w:sz w:val="24"/>
-          <w:szCs w:val="24"/>
           <w:rtl w:val="0"/>
         </w:rPr>
         <w:t xml:space="preserve">Я зростала в оточенні лікарів, тому професія медика захоплювала та надихала мене ще з дитинства — це був усвідомлений вибір серця.</w:t>
@@ -2020,16 +1670,12 @@
       <w:pPr>
         <w:rPr>
           <w:color w:val="1d1c1d"/>
-          <w:sz w:val="24"/>
-          <w:szCs w:val="24"/>
-        </w:rPr>
-      </w:pPr>
-      <w:r>
-        <w:rPr>
-          <w:b w:val="1"/>
-          <w:bCs w:val="1"/>
-          <w:sz w:val="24"/>
-          <w:szCs w:val="24"/>
+        </w:rPr>
+      </w:pPr>
+      <w:r>
+        <w:rPr>
+          <w:b w:val="1"/>
+          <w:bCs w:val="1"/>
           <w:rtl w:val="0"/>
         </w:rPr>
         <w:t xml:space="preserve">Про себе: </w:t>
@@ -2037,8 +1683,6 @@
       <w:r>
         <w:rPr>
           <w:color w:val="1d1c1d"/>
-          <w:sz w:val="24"/>
-          <w:szCs w:val="24"/>
           <w:rtl w:val="0"/>
         </w:rPr>
         <w:t xml:space="preserve">Я — сімейний лікар. Починала свій шлях як дитячий лікар, а згодом розширила практику до сімейної медицини, щоб супроводжувати пацієнтів усіх вікових груп. Поза медициною я захоплююся катанням на лижах, читанням книжок і дуже ціную час, проведений у колі близьких людей.</w:t>
@@ -2058,17 +1702,13 @@
           <w:b w:val="1"/>
           <w:bCs w:val="1"/>
           <w:color w:val="1d1c1d"/>
-          <w:sz w:val="24"/>
-          <w:szCs w:val="24"/>
-        </w:rPr>
-      </w:pPr>
-      <w:r>
-        <w:rPr>
-          <w:b w:val="1"/>
-          <w:bCs w:val="1"/>
-          <w:color w:val="1d1c1d"/>
-          <w:sz w:val="24"/>
-          <w:szCs w:val="24"/>
+        </w:rPr>
+      </w:pPr>
+      <w:r>
+        <w:rPr>
+          <w:b w:val="1"/>
+          <w:bCs w:val="1"/>
+          <w:color w:val="1d1c1d"/>
           <w:rtl w:val="0"/>
         </w:rPr>
         <w:t xml:space="preserve">Напрями роботи:</w:t>
@@ -2086,15 +1726,11 @@
         <w:spacing w:after="60" w:before="60" w:lineRule="auto"/>
         <w:rPr>
           <w:color w:val="1d1c1d"/>
-          <w:sz w:val="24"/>
-          <w:szCs w:val="24"/>
-        </w:rPr>
-      </w:pPr>
-      <w:r>
-        <w:rPr>
-          <w:color w:val="1d1c1d"/>
-          <w:sz w:val="24"/>
-          <w:szCs w:val="24"/>
+        </w:rPr>
+      </w:pPr>
+      <w:r>
+        <w:rPr>
+          <w:color w:val="1d1c1d"/>
           <w:rtl w:val="0"/>
         </w:rPr>
         <w:t xml:space="preserve">Профілактика та консультації дітей і дорослих</w:t>
@@ -2112,15 +1748,11 @@
         <w:spacing w:after="60" w:before="60" w:lineRule="auto"/>
         <w:rPr>
           <w:color w:val="1d1c1d"/>
-          <w:sz w:val="24"/>
-          <w:szCs w:val="24"/>
-        </w:rPr>
-      </w:pPr>
-      <w:r>
-        <w:rPr>
-          <w:color w:val="1d1c1d"/>
-          <w:sz w:val="24"/>
-          <w:szCs w:val="24"/>
+        </w:rPr>
+      </w:pPr>
+      <w:r>
+        <w:rPr>
+          <w:color w:val="1d1c1d"/>
           <w:rtl w:val="0"/>
         </w:rPr>
         <w:t xml:space="preserve">Оцінка лабораторних та діагностичних обстежень</w:t>
@@ -2138,15 +1770,11 @@
         <w:spacing w:after="60" w:before="60" w:lineRule="auto"/>
         <w:rPr>
           <w:color w:val="1d1c1d"/>
-          <w:sz w:val="24"/>
-          <w:szCs w:val="24"/>
-        </w:rPr>
-      </w:pPr>
-      <w:r>
-        <w:rPr>
-          <w:color w:val="1d1c1d"/>
-          <w:sz w:val="24"/>
-          <w:szCs w:val="24"/>
+        </w:rPr>
+      </w:pPr>
+      <w:r>
+        <w:rPr>
+          <w:color w:val="1d1c1d"/>
           <w:rtl w:val="0"/>
         </w:rPr>
         <w:t xml:space="preserve">Вакцинація дітей і дорослих</w:t>
@@ -2164,15 +1792,11 @@
         <w:spacing w:after="60" w:before="60" w:lineRule="auto"/>
         <w:rPr>
           <w:color w:val="1d1c1d"/>
-          <w:sz w:val="24"/>
-          <w:szCs w:val="24"/>
-        </w:rPr>
-      </w:pPr>
-      <w:r>
-        <w:rPr>
-          <w:color w:val="1d1c1d"/>
-          <w:sz w:val="24"/>
-          <w:szCs w:val="24"/>
+        </w:rPr>
+      </w:pPr>
+      <w:r>
+        <w:rPr>
+          <w:color w:val="1d1c1d"/>
           <w:rtl w:val="0"/>
         </w:rPr>
         <w:t xml:space="preserve">Лікування гострих та хронічних захворювань.</w:t>
@@ -2182,17 +1806,13 @@
       <w:pPr>
         <w:rPr>
           <w:color w:val="2f2e2e"/>
-          <w:sz w:val="24"/>
-          <w:szCs w:val="24"/>
-        </w:rPr>
-      </w:pPr>
-      <w:r>
-        <w:rPr>
-          <w:b w:val="1"/>
-          <w:bCs w:val="1"/>
-          <w:color w:val="2f2e2e"/>
-          <w:sz w:val="24"/>
-          <w:szCs w:val="24"/>
+        </w:rPr>
+      </w:pPr>
+      <w:r>
+        <w:rPr>
+          <w:b w:val="1"/>
+          <w:bCs w:val="1"/>
+          <w:color w:val="2f2e2e"/>
           <w:rtl w:val="0"/>
         </w:rPr>
         <w:t xml:space="preserve">Локація:</w:t>
@@ -2200,8 +1820,6 @@
       <w:r>
         <w:rPr>
           <w:color w:val="2f2e2e"/>
-          <w:sz w:val="24"/>
-          <w:szCs w:val="24"/>
           <w:rtl w:val="0"/>
         </w:rPr>
         <w:t xml:space="preserve">  м.Львів вул.Стрийська 86В</w:t>
@@ -2244,32 +1862,26 @@
       <w:pPr>
         <w:rPr>
           <w:color w:val="2f2e2e"/>
-          <w:sz w:val="24"/>
-          <w:szCs w:val="24"/>
-        </w:rPr>
-      </w:pPr>
-      <w:r>
-        <w:rPr>
-          <w:rtl w:val="0"/>
-        </w:rPr>
-      </w:r>
-    </w:p>
-    <w:p>
-      <w:pPr>
-        <w:rPr>
-          <w:b w:val="1"/>
-          <w:bCs w:val="1"/>
-          <w:color w:val="2f2e2e"/>
-          <w:sz w:val="24"/>
-          <w:szCs w:val="24"/>
-        </w:rPr>
-      </w:pPr>
-      <w:r>
-        <w:rPr>
-          <w:b w:val="1"/>
-          <w:bCs w:val="1"/>
-          <w:sz w:val="24"/>
-          <w:szCs w:val="24"/>
+        </w:rPr>
+      </w:pPr>
+      <w:r>
+        <w:rPr>
+          <w:rtl w:val="0"/>
+        </w:rPr>
+      </w:r>
+    </w:p>
+    <w:p>
+      <w:pPr>
+        <w:rPr>
+          <w:b w:val="1"/>
+          <w:bCs w:val="1"/>
+          <w:color w:val="2f2e2e"/>
+        </w:rPr>
+      </w:pPr>
+      <w:r>
+        <w:rPr>
+          <w:b w:val="1"/>
+          <w:bCs w:val="1"/>
           <w:rtl w:val="0"/>
         </w:rPr>
         <w:t xml:space="preserve">8. ЮЛІЯ ЛІСОВСЬКА - </w:t>
@@ -2279,8 +1891,6 @@
           <w:b w:val="1"/>
           <w:bCs w:val="1"/>
           <w:color w:val="2f2e2e"/>
-          <w:sz w:val="24"/>
-          <w:szCs w:val="24"/>
           <w:rtl w:val="0"/>
         </w:rPr>
         <w:t xml:space="preserve">лікар-педіатр</w:t>
@@ -2288,25 +1898,18 @@
     </w:p>
     <w:p>
       <w:pPr>
-        <w:rPr>
-          <w:sz w:val="24"/>
-          <w:szCs w:val="24"/>
-        </w:rPr>
-      </w:pPr>
-      <w:r>
-        <w:rPr>
-          <w:b w:val="1"/>
-          <w:bCs w:val="1"/>
-          <w:sz w:val="24"/>
-          <w:szCs w:val="24"/>
+        <w:rPr/>
+      </w:pPr>
+      <w:r>
+        <w:rPr>
+          <w:b w:val="1"/>
+          <w:bCs w:val="1"/>
           <w:rtl w:val="0"/>
         </w:rPr>
         <w:t xml:space="preserve">Освіта:</w:t>
       </w:r>
       <w:r>
         <w:rPr>
-          <w:sz w:val="24"/>
-          <w:szCs w:val="24"/>
           <w:rtl w:val="0"/>
         </w:rPr>
         <w:t xml:space="preserve"> </w:t>
@@ -2314,16 +1917,12 @@
       <w:r>
         <w:rPr>
           <w:color w:val="1d1c1d"/>
-          <w:sz w:val="24"/>
-          <w:szCs w:val="24"/>
           <w:rtl w:val="0"/>
         </w:rPr>
         <w:t xml:space="preserve"> </w:t>
       </w:r>
       <w:r>
         <w:rPr>
-          <w:sz w:val="24"/>
-          <w:szCs w:val="24"/>
           <w:rtl w:val="0"/>
         </w:rPr>
         <w:t xml:space="preserve"> ЛНМУ ім. Данила Галицького</w:t>
@@ -2338,15 +1937,10 @@
           <w:right w:color="auto" w:space="0" w:sz="0" w:val="none"/>
           <w:between w:color="auto" w:space="0" w:sz="0" w:val="none"/>
         </w:pBdr>
-        <w:rPr>
-          <w:sz w:val="24"/>
-          <w:szCs w:val="24"/>
-        </w:rPr>
-      </w:pPr>
-      <w:r>
-        <w:rPr>
-          <w:sz w:val="24"/>
-          <w:szCs w:val="24"/>
+        <w:rPr/>
+      </w:pPr>
+      <w:r>
+        <w:rPr>
           <w:rtl w:val="0"/>
         </w:rPr>
         <w:t xml:space="preserve">Основний навик: лікар-педіатр</w:t>
@@ -2363,14 +1957,10 @@
         </w:pBdr>
         <w:rPr>
           <w:color w:val="1d1c1d"/>
-          <w:sz w:val="24"/>
-          <w:szCs w:val="24"/>
-        </w:rPr>
-      </w:pPr>
-      <w:r>
-        <w:rPr>
-          <w:sz w:val="24"/>
-          <w:szCs w:val="24"/>
+        </w:rPr>
+      </w:pPr>
+      <w:r>
+        <w:rPr>
           <w:rtl w:val="0"/>
         </w:rPr>
         <w:t xml:space="preserve">Кількість років у галузі: 8</w:t>
@@ -2385,24 +1975,18 @@
       <w:pPr>
         <w:rPr>
           <w:color w:val="1d1c1d"/>
-          <w:sz w:val="24"/>
-          <w:szCs w:val="24"/>
-        </w:rPr>
-      </w:pPr>
-      <w:r>
-        <w:rPr>
-          <w:b w:val="1"/>
-          <w:bCs w:val="1"/>
-          <w:sz w:val="24"/>
-          <w:szCs w:val="24"/>
+        </w:rPr>
+      </w:pPr>
+      <w:r>
+        <w:rPr>
+          <w:b w:val="1"/>
+          <w:bCs w:val="1"/>
           <w:rtl w:val="0"/>
         </w:rPr>
         <w:t xml:space="preserve">Чому обрала цю професію:</w:t>
       </w:r>
       <w:r>
         <w:rPr>
-          <w:sz w:val="24"/>
-          <w:szCs w:val="24"/>
           <w:rtl w:val="0"/>
         </w:rPr>
         <w:t xml:space="preserve">Я стала лікаркою, бо це була моя мрія ще з дитинства і це бажання залишалося зі мною протягом всього шляху.</w:t>
@@ -2417,24 +2001,18 @@
       <w:pPr>
         <w:rPr>
           <w:color w:val="1d1c1d"/>
-          <w:sz w:val="24"/>
-          <w:szCs w:val="24"/>
-        </w:rPr>
-      </w:pPr>
-      <w:r>
-        <w:rPr>
-          <w:b w:val="1"/>
-          <w:bCs w:val="1"/>
-          <w:sz w:val="24"/>
-          <w:szCs w:val="24"/>
+        </w:rPr>
+      </w:pPr>
+      <w:r>
+        <w:rPr>
+          <w:b w:val="1"/>
+          <w:bCs w:val="1"/>
           <w:rtl w:val="0"/>
         </w:rPr>
         <w:t xml:space="preserve">Про себе: </w:t>
       </w:r>
       <w:r>
         <w:rPr>
-          <w:sz w:val="24"/>
-          <w:szCs w:val="24"/>
           <w:rtl w:val="0"/>
         </w:rPr>
         <w:t xml:space="preserve">Для мене важливо, щоб дитині на прийомі було комфортно та безпечно і щоб вона відчувала підтримку навіть під час неприємних для неї моментів огляду чи процедур.</w:t>
@@ -2457,25 +2035,19 @@
         <w:spacing w:after="60" w:before="60" w:lineRule="auto"/>
         <w:rPr>
           <w:color w:val="1d1c1d"/>
-          <w:sz w:val="24"/>
-          <w:szCs w:val="24"/>
-        </w:rPr>
-      </w:pPr>
-      <w:r>
-        <w:rPr>
-          <w:b w:val="1"/>
-          <w:bCs w:val="1"/>
-          <w:color w:val="1d1c1d"/>
-          <w:sz w:val="24"/>
-          <w:szCs w:val="24"/>
+        </w:rPr>
+      </w:pPr>
+      <w:r>
+        <w:rPr>
+          <w:b w:val="1"/>
+          <w:bCs w:val="1"/>
+          <w:color w:val="1d1c1d"/>
           <w:rtl w:val="0"/>
         </w:rPr>
         <w:t xml:space="preserve">Напрями роботи: </w:t>
       </w:r>
       <w:r>
         <w:rPr>
-          <w:sz w:val="24"/>
-          <w:szCs w:val="24"/>
           <w:rtl w:val="0"/>
         </w:rPr>
         <w:t xml:space="preserve">педіатрія та грудне вигодовування</w:t>
@@ -2490,17 +2062,13 @@
       <w:pPr>
         <w:rPr>
           <w:color w:val="2f2e2e"/>
-          <w:sz w:val="24"/>
-          <w:szCs w:val="24"/>
-        </w:rPr>
-      </w:pPr>
-      <w:r>
-        <w:rPr>
-          <w:b w:val="1"/>
-          <w:bCs w:val="1"/>
-          <w:color w:val="2f2e2e"/>
-          <w:sz w:val="24"/>
-          <w:szCs w:val="24"/>
+        </w:rPr>
+      </w:pPr>
+      <w:r>
+        <w:rPr>
+          <w:b w:val="1"/>
+          <w:bCs w:val="1"/>
+          <w:color w:val="2f2e2e"/>
           <w:rtl w:val="0"/>
         </w:rPr>
         <w:t xml:space="preserve">Локація:</w:t>
@@ -2508,8 +2076,6 @@
       <w:r>
         <w:rPr>
           <w:color w:val="2f2e2e"/>
-          <w:sz w:val="24"/>
-          <w:szCs w:val="24"/>
           <w:rtl w:val="0"/>
         </w:rPr>
         <w:t xml:space="preserve">  м.Львів вул.Стрийська 86В</w:t>
@@ -2527,8 +2093,6 @@
         <w:spacing w:after="60" w:before="60" w:lineRule="auto"/>
         <w:rPr>
           <w:color w:val="2f2e2e"/>
-          <w:sz w:val="24"/>
-          <w:szCs w:val="24"/>
         </w:rPr>
       </w:pPr>
       <w:r>
@@ -2600,17 +2164,13 @@
           <w:b w:val="1"/>
           <w:bCs w:val="1"/>
           <w:color w:val="2f2e2e"/>
-          <w:sz w:val="24"/>
-          <w:szCs w:val="24"/>
-        </w:rPr>
-      </w:pPr>
-      <w:r>
-        <w:rPr>
-          <w:b w:val="1"/>
-          <w:bCs w:val="1"/>
-          <w:color w:val="2f2e2e"/>
-          <w:sz w:val="24"/>
-          <w:szCs w:val="24"/>
+        </w:rPr>
+      </w:pPr>
+      <w:r>
+        <w:rPr>
+          <w:b w:val="1"/>
+          <w:bCs w:val="1"/>
+          <w:color w:val="2f2e2e"/>
           <w:rtl w:val="0"/>
         </w:rPr>
         <w:t xml:space="preserve">9. НАТАЛІЯ КРИШЕНИК - лікар-терапевт</w:t>
@@ -2628,16 +2188,12 @@
         <w:spacing w:after="60" w:before="60" w:lineRule="auto"/>
         <w:rPr>
           <w:color w:val="1d1c1d"/>
-          <w:sz w:val="24"/>
-          <w:szCs w:val="24"/>
-        </w:rPr>
-      </w:pPr>
-      <w:r>
-        <w:rPr>
-          <w:b w:val="1"/>
-          <w:bCs w:val="1"/>
-          <w:sz w:val="24"/>
-          <w:szCs w:val="24"/>
+        </w:rPr>
+      </w:pPr>
+      <w:r>
+        <w:rPr>
+          <w:b w:val="1"/>
+          <w:bCs w:val="1"/>
           <w:rtl w:val="0"/>
         </w:rPr>
         <w:t xml:space="preserve">Освіта:</w:t>
@@ -2645,8 +2201,6 @@
       <w:r>
         <w:rPr>
           <w:color w:val="1d1c1d"/>
-          <w:sz w:val="24"/>
-          <w:szCs w:val="24"/>
           <w:rtl w:val="0"/>
         </w:rPr>
         <w:t xml:space="preserve">ЛНМУ 2016-2022 р., основний навик лікар-терапевт ( 4+ роки)</w:t>
@@ -2656,16 +2210,12 @@
       <w:pPr>
         <w:rPr>
           <w:color w:val="1d1c1d"/>
-          <w:sz w:val="24"/>
-          <w:szCs w:val="24"/>
-        </w:rPr>
-      </w:pPr>
-      <w:r>
-        <w:rPr>
-          <w:b w:val="1"/>
-          <w:bCs w:val="1"/>
-          <w:sz w:val="24"/>
-          <w:szCs w:val="24"/>
+        </w:rPr>
+      </w:pPr>
+      <w:r>
+        <w:rPr>
+          <w:b w:val="1"/>
+          <w:bCs w:val="1"/>
           <w:rtl w:val="0"/>
         </w:rPr>
         <w:t xml:space="preserve">Чому обрала цю професію: </w:t>
@@ -2673,8 +2223,6 @@
       <w:r>
         <w:rPr>
           <w:color w:val="1d1c1d"/>
-          <w:sz w:val="24"/>
-          <w:szCs w:val="24"/>
           <w:rtl w:val="0"/>
         </w:rPr>
         <w:t xml:space="preserve">Я стала лікарем, тому що завжди була переконана, що медицина - це про якість життя. Мене цікавив  не тільки процес лікування, але й попередження появи захворювань.</w:t>
@@ -2684,24 +2232,18 @@
       <w:pPr>
         <w:rPr>
           <w:color w:val="1d1c1d"/>
-          <w:sz w:val="24"/>
-          <w:szCs w:val="24"/>
-        </w:rPr>
-      </w:pPr>
-      <w:r>
-        <w:rPr>
-          <w:b w:val="1"/>
-          <w:bCs w:val="1"/>
-          <w:sz w:val="24"/>
-          <w:szCs w:val="24"/>
+        </w:rPr>
+      </w:pPr>
+      <w:r>
+        <w:rPr>
+          <w:b w:val="1"/>
+          <w:bCs w:val="1"/>
           <w:rtl w:val="0"/>
         </w:rPr>
         <w:t xml:space="preserve">Про себе: </w:t>
       </w:r>
       <w:r>
         <w:rPr>
-          <w:sz w:val="24"/>
-          <w:szCs w:val="24"/>
           <w:rtl w:val="0"/>
         </w:rPr>
         <w:t xml:space="preserve">Для мене важл</w:t>
@@ -2709,8 +2251,6 @@
       <w:r>
         <w:rPr>
           <w:color w:val="1d1c1d"/>
-          <w:sz w:val="24"/>
-          <w:szCs w:val="24"/>
           <w:rtl w:val="0"/>
         </w:rPr>
         <w:t xml:space="preserve">Радію, що можу вносити позитивні зміни в життя людей і бачити, як мої зусилля допомагають покращувати якість та тривалість життя.</w:t>
@@ -2726,18 +2266,13 @@
           <w:between w:color="auto" w:space="0" w:sz="0" w:val="none"/>
         </w:pBdr>
         <w:spacing w:after="60" w:before="60" w:lineRule="auto"/>
-        <w:rPr>
-          <w:sz w:val="24"/>
-          <w:szCs w:val="24"/>
-        </w:rPr>
-      </w:pPr>
-      <w:r>
-        <w:rPr>
-          <w:b w:val="1"/>
-          <w:bCs w:val="1"/>
-          <w:color w:val="1d1c1d"/>
-          <w:sz w:val="24"/>
-          <w:szCs w:val="24"/>
+        <w:rPr/>
+      </w:pPr>
+      <w:r>
+        <w:rPr>
+          <w:b w:val="1"/>
+          <w:bCs w:val="1"/>
+          <w:color w:val="1d1c1d"/>
           <w:rtl w:val="0"/>
         </w:rPr>
         <w:t xml:space="preserve">Напрями роботи: </w:t>
@@ -2745,8 +2280,6 @@
       <w:r>
         <w:rPr>
           <w:color w:val="1d1c1d"/>
-          <w:sz w:val="24"/>
-          <w:szCs w:val="24"/>
           <w:rtl w:val="0"/>
         </w:rPr>
         <w:t xml:space="preserve">лікар-терапевт, лікар функціональної діагностики </w:t>
@@ -2761,17 +2294,13 @@
       <w:pPr>
         <w:rPr>
           <w:color w:val="2f2e2e"/>
-          <w:sz w:val="24"/>
-          <w:szCs w:val="24"/>
-        </w:rPr>
-      </w:pPr>
-      <w:r>
-        <w:rPr>
-          <w:b w:val="1"/>
-          <w:bCs w:val="1"/>
-          <w:color w:val="2f2e2e"/>
-          <w:sz w:val="24"/>
-          <w:szCs w:val="24"/>
+        </w:rPr>
+      </w:pPr>
+      <w:r>
+        <w:rPr>
+          <w:b w:val="1"/>
+          <w:bCs w:val="1"/>
+          <w:color w:val="2f2e2e"/>
           <w:rtl w:val="0"/>
         </w:rPr>
         <w:t xml:space="preserve">Локація:</w:t>
@@ -2779,8 +2308,6 @@
       <w:r>
         <w:rPr>
           <w:color w:val="2f2e2e"/>
-          <w:sz w:val="24"/>
-          <w:szCs w:val="24"/>
           <w:rtl w:val="0"/>
         </w:rPr>
         <w:t xml:space="preserve">  м.Львів, вул.Тичини 21 </w:t>
@@ -2790,22 +2317,18 @@
       <w:pPr>
         <w:rPr>
           <w:color w:val="2f2e2e"/>
-          <w:sz w:val="24"/>
-          <w:szCs w:val="24"/>
-        </w:rPr>
-      </w:pPr>
-      <w:r>
-        <w:rPr>
-          <w:rtl w:val="0"/>
-        </w:rPr>
-      </w:r>
-    </w:p>
-    <w:p>
-      <w:pPr>
-        <w:rPr>
-          <w:color w:val="2f2e2e"/>
-          <w:sz w:val="24"/>
-          <w:szCs w:val="24"/>
+        </w:rPr>
+      </w:pPr>
+      <w:r>
+        <w:rPr>
+          <w:rtl w:val="0"/>
+        </w:rPr>
+      </w:r>
+    </w:p>
+    <w:p>
+      <w:pPr>
+        <w:rPr>
+          <w:color w:val="2f2e2e"/>
         </w:rPr>
       </w:pPr>
       <w:r>
@@ -2831,41 +2354,35 @@
         <w:spacing w:after="60" w:before="60" w:lineRule="auto"/>
         <w:rPr>
           <w:color w:val="2f2e2e"/>
-          <w:sz w:val="24"/>
-          <w:szCs w:val="24"/>
-        </w:rPr>
-      </w:pPr>
-      <w:r>
-        <w:rPr>
-          <w:rtl w:val="0"/>
-        </w:rPr>
-      </w:r>
-    </w:p>
-    <w:p>
-      <w:pPr>
-        <w:pBdr>
-          <w:top w:color="auto" w:space="0" w:sz="0" w:val="none"/>
-          <w:left w:color="auto" w:space="0" w:sz="0" w:val="none"/>
-          <w:bottom w:color="auto" w:space="0" w:sz="0" w:val="none"/>
-          <w:right w:color="auto" w:space="0" w:sz="0" w:val="none"/>
-          <w:between w:color="auto" w:space="0" w:sz="0" w:val="none"/>
-        </w:pBdr>
-        <w:spacing w:after="60" w:before="60" w:lineRule="auto"/>
-        <w:rPr>
-          <w:b w:val="1"/>
-          <w:bCs w:val="1"/>
-          <w:color w:val="2f2e2e"/>
-          <w:sz w:val="24"/>
-          <w:szCs w:val="24"/>
-        </w:rPr>
-      </w:pPr>
-      <w:r>
-        <w:rPr>
-          <w:b w:val="1"/>
-          <w:bCs w:val="1"/>
-          <w:color w:val="2f2e2e"/>
-          <w:sz w:val="24"/>
-          <w:szCs w:val="24"/>
+        </w:rPr>
+      </w:pPr>
+      <w:r>
+        <w:rPr>
+          <w:rtl w:val="0"/>
+        </w:rPr>
+      </w:r>
+    </w:p>
+    <w:p>
+      <w:pPr>
+        <w:pBdr>
+          <w:top w:color="auto" w:space="0" w:sz="0" w:val="none"/>
+          <w:left w:color="auto" w:space="0" w:sz="0" w:val="none"/>
+          <w:bottom w:color="auto" w:space="0" w:sz="0" w:val="none"/>
+          <w:right w:color="auto" w:space="0" w:sz="0" w:val="none"/>
+          <w:between w:color="auto" w:space="0" w:sz="0" w:val="none"/>
+        </w:pBdr>
+        <w:spacing w:after="60" w:before="60" w:lineRule="auto"/>
+        <w:rPr>
+          <w:b w:val="1"/>
+          <w:bCs w:val="1"/>
+          <w:color w:val="2f2e2e"/>
+        </w:rPr>
+      </w:pPr>
+      <w:r>
+        <w:rPr>
+          <w:b w:val="1"/>
+          <w:bCs w:val="1"/>
+          <w:color w:val="2f2e2e"/>
           <w:rtl w:val="0"/>
         </w:rPr>
         <w:t xml:space="preserve">10. ЮЛІАН КОНЕЧНИЙ - лікар-терапевт</w:t>
@@ -2883,16 +2400,12 @@
         <w:spacing w:after="60" w:before="60" w:lineRule="auto"/>
         <w:rPr>
           <w:color w:val="1d1c1d"/>
-          <w:sz w:val="24"/>
-          <w:szCs w:val="24"/>
-        </w:rPr>
-      </w:pPr>
-      <w:r>
-        <w:rPr>
-          <w:b w:val="1"/>
-          <w:bCs w:val="1"/>
-          <w:sz w:val="24"/>
-          <w:szCs w:val="24"/>
+        </w:rPr>
+      </w:pPr>
+      <w:r>
+        <w:rPr>
+          <w:b w:val="1"/>
+          <w:bCs w:val="1"/>
           <w:rtl w:val="0"/>
         </w:rPr>
         <w:t xml:space="preserve">Освіта:</w:t>
@@ -2900,8 +2413,6 @@
       <w:r>
         <w:rPr>
           <w:color w:val="1d1c1d"/>
-          <w:sz w:val="24"/>
-          <w:szCs w:val="24"/>
           <w:rtl w:val="0"/>
         </w:rPr>
         <w:t xml:space="preserve">науковець (медична мікробіологія, грантовий менеджмент, ЛНМУ, 10+ років); лікар (лікар-терапевт, Вулик, 3+ роки); викладач (мікробіологія, ЛНМУ, 5+ років)</w:t>
@@ -2911,16 +2422,12 @@
       <w:pPr>
         <w:rPr>
           <w:color w:val="1d1c1d"/>
-          <w:sz w:val="24"/>
-          <w:szCs w:val="24"/>
-        </w:rPr>
-      </w:pPr>
-      <w:r>
-        <w:rPr>
-          <w:b w:val="1"/>
-          <w:bCs w:val="1"/>
-          <w:sz w:val="24"/>
-          <w:szCs w:val="24"/>
+        </w:rPr>
+      </w:pPr>
+      <w:r>
+        <w:rPr>
+          <w:b w:val="1"/>
+          <w:bCs w:val="1"/>
           <w:rtl w:val="0"/>
         </w:rPr>
         <w:t xml:space="preserve">Чому обрав цю професію: </w:t>
@@ -2928,8 +2435,6 @@
       <w:r>
         <w:rPr>
           <w:color w:val="1d1c1d"/>
-          <w:sz w:val="24"/>
-          <w:szCs w:val="24"/>
           <w:rtl w:val="0"/>
         </w:rPr>
         <w:t xml:space="preserve">Я став лікарем-науковцем, тому що мені цікаво досліджувати нові горизонти людського організму на основі доказової медицини.</w:t>
@@ -2939,16 +2444,12 @@
       <w:pPr>
         <w:rPr>
           <w:color w:val="1d1c1d"/>
-          <w:sz w:val="24"/>
-          <w:szCs w:val="24"/>
-        </w:rPr>
-      </w:pPr>
-      <w:r>
-        <w:rPr>
-          <w:b w:val="1"/>
-          <w:bCs w:val="1"/>
-          <w:sz w:val="24"/>
-          <w:szCs w:val="24"/>
+        </w:rPr>
+      </w:pPr>
+      <w:r>
+        <w:rPr>
+          <w:b w:val="1"/>
+          <w:bCs w:val="1"/>
           <w:rtl w:val="0"/>
         </w:rPr>
         <w:t xml:space="preserve">Про себе: </w:t>
@@ -2956,8 +2457,6 @@
       <w:r>
         <w:rPr>
           <w:color w:val="1d1c1d"/>
-          <w:sz w:val="24"/>
-          <w:szCs w:val="24"/>
           <w:rtl w:val="0"/>
         </w:rPr>
         <w:t xml:space="preserve">Юліан Конечний - лікар-науковець, вегетаріан-френдлі, квір-френдлі.</w:t>
@@ -2976,15 +2475,11 @@
         <w:ind w:left="0" w:firstLine="0"/>
         <w:rPr>
           <w:color w:val="1d1c1d"/>
-          <w:sz w:val="24"/>
-          <w:szCs w:val="24"/>
-        </w:rPr>
-      </w:pPr>
-      <w:r>
-        <w:rPr>
-          <w:color w:val="1d1c1d"/>
-          <w:sz w:val="24"/>
-          <w:szCs w:val="24"/>
+        </w:rPr>
+      </w:pPr>
+      <w:r>
+        <w:rPr>
+          <w:color w:val="1d1c1d"/>
           <w:rtl w:val="0"/>
         </w:rPr>
         <w:t xml:space="preserve">Вірю, що збалансоване поєднання клінічної практики, науки та освіти зробить медицину в Україні якісною та є кроком до Євроінтеграції. Керівник наукових проєктів, працюю над євроінтеграцією системи охорони здоров'я регіону. </w:t>
@@ -3002,17 +2497,13 @@
         <w:spacing w:after="60" w:before="60" w:lineRule="auto"/>
         <w:rPr>
           <w:color w:val="1d1c1d"/>
-          <w:sz w:val="24"/>
-          <w:szCs w:val="24"/>
-        </w:rPr>
-      </w:pPr>
-      <w:r>
-        <w:rPr>
-          <w:b w:val="1"/>
-          <w:bCs w:val="1"/>
-          <w:color w:val="1d1c1d"/>
-          <w:sz w:val="24"/>
-          <w:szCs w:val="24"/>
+        </w:rPr>
+      </w:pPr>
+      <w:r>
+        <w:rPr>
+          <w:b w:val="1"/>
+          <w:bCs w:val="1"/>
+          <w:color w:val="1d1c1d"/>
           <w:rtl w:val="0"/>
         </w:rPr>
         <w:t xml:space="preserve">Напрями роботи: </w:t>
@@ -3020,8 +2511,6 @@
       <w:r>
         <w:rPr>
           <w:color w:val="1d1c1d"/>
-          <w:sz w:val="24"/>
-          <w:szCs w:val="24"/>
           <w:rtl w:val="0"/>
         </w:rPr>
         <w:t xml:space="preserve">лікар-терапевт</w:t>
@@ -3039,17 +2528,13 @@
         <w:spacing w:after="60" w:before="60" w:lineRule="auto"/>
         <w:rPr>
           <w:color w:val="2f2e2e"/>
-          <w:sz w:val="24"/>
-          <w:szCs w:val="24"/>
-        </w:rPr>
-      </w:pPr>
-      <w:r>
-        <w:rPr>
-          <w:b w:val="1"/>
-          <w:bCs w:val="1"/>
-          <w:color w:val="2f2e2e"/>
-          <w:sz w:val="24"/>
-          <w:szCs w:val="24"/>
+        </w:rPr>
+      </w:pPr>
+      <w:r>
+        <w:rPr>
+          <w:b w:val="1"/>
+          <w:bCs w:val="1"/>
+          <w:color w:val="2f2e2e"/>
           <w:rtl w:val="0"/>
         </w:rPr>
         <w:t xml:space="preserve">Локація:</w:t>
@@ -3057,8 +2542,6 @@
       <w:r>
         <w:rPr>
           <w:color w:val="2f2e2e"/>
-          <w:sz w:val="24"/>
-          <w:szCs w:val="24"/>
           <w:rtl w:val="0"/>
         </w:rPr>
         <w:t xml:space="preserve">  м.Львів вул.Стрийська 86В</w:t>
@@ -3076,8 +2559,6 @@
         <w:spacing w:after="60" w:before="60" w:lineRule="auto"/>
         <w:rPr>
           <w:color w:val="2f2e2e"/>
-          <w:sz w:val="24"/>
-          <w:szCs w:val="24"/>
         </w:rPr>
       </w:pPr>
       <w:r>
@@ -3124,75 +2605,597 @@
         </w:pBdr>
         <w:spacing w:after="60" w:before="60" w:lineRule="auto"/>
         <w:rPr>
-          <w:color w:val="2f2e2e"/>
-          <w:sz w:val="24"/>
-          <w:szCs w:val="24"/>
-        </w:rPr>
-      </w:pPr>
-      <w:r>
-        <w:rPr>
-          <w:rtl w:val="0"/>
-        </w:rPr>
-      </w:r>
-    </w:p>
-    <w:p>
-      <w:pPr>
-        <w:pBdr>
-          <w:top w:color="auto" w:space="0" w:sz="0" w:val="none"/>
-          <w:left w:color="auto" w:space="0" w:sz="0" w:val="none"/>
-          <w:bottom w:color="auto" w:space="0" w:sz="0" w:val="none"/>
-          <w:right w:color="auto" w:space="0" w:sz="0" w:val="none"/>
-          <w:between w:color="auto" w:space="0" w:sz="0" w:val="none"/>
-        </w:pBdr>
-        <w:spacing w:after="60" w:before="60" w:lineRule="auto"/>
-        <w:rPr>
-          <w:b w:val="1"/>
-          <w:bCs w:val="1"/>
-          <w:color w:val="2f2e2e"/>
-          <w:sz w:val="24"/>
-          <w:szCs w:val="24"/>
-        </w:rPr>
-      </w:pPr>
-      <w:r>
-        <w:rPr>
-          <w:b w:val="1"/>
-          <w:bCs w:val="1"/>
-          <w:color w:val="2f2e2e"/>
-          <w:sz w:val="24"/>
-          <w:szCs w:val="24"/>
-          <w:rtl w:val="0"/>
-        </w:rPr>
-        <w:t xml:space="preserve">10. ІРИНА ЛЕХОЦІНСЬКА</w:t>
-      </w:r>
-    </w:p>
-    <w:p>
-      <w:pPr>
-        <w:pBdr>
-          <w:top w:color="auto" w:space="0" w:sz="0" w:val="none"/>
-          <w:left w:color="auto" w:space="0" w:sz="0" w:val="none"/>
-          <w:bottom w:color="auto" w:space="0" w:sz="0" w:val="none"/>
-          <w:right w:color="auto" w:space="0" w:sz="0" w:val="none"/>
-          <w:between w:color="auto" w:space="0" w:sz="0" w:val="none"/>
-        </w:pBdr>
-        <w:spacing w:after="60" w:before="60" w:lineRule="auto"/>
-        <w:rPr>
-          <w:color w:val="2f2e2e"/>
-          <w:sz w:val="24"/>
-          <w:szCs w:val="24"/>
-        </w:rPr>
-      </w:pPr>
-      <w:r>
-        <w:rPr>
-          <w:rtl w:val="0"/>
-        </w:rPr>
-      </w:r>
-    </w:p>
-    <w:p>
-      <w:pPr>
-        <w:rPr>
-          <w:color w:val="2f2e2e"/>
-          <w:sz w:val="24"/>
-          <w:szCs w:val="24"/>
+          <w:b w:val="1"/>
+          <w:bCs w:val="1"/>
+          <w:color w:val="2f2e2e"/>
+        </w:rPr>
+      </w:pPr>
+      <w:r>
+        <w:rPr>
+          <w:rtl w:val="0"/>
+        </w:rPr>
+      </w:r>
+    </w:p>
+    <w:p>
+      <w:pPr>
+        <w:pBdr>
+          <w:top w:color="auto" w:space="0" w:sz="0" w:val="none"/>
+          <w:left w:color="auto" w:space="0" w:sz="0" w:val="none"/>
+          <w:bottom w:color="auto" w:space="0" w:sz="0" w:val="none"/>
+          <w:right w:color="auto" w:space="0" w:sz="0" w:val="none"/>
+          <w:between w:color="auto" w:space="0" w:sz="0" w:val="none"/>
+        </w:pBdr>
+        <w:spacing w:after="60" w:before="60" w:lineRule="auto"/>
+        <w:rPr>
+          <w:b w:val="1"/>
+          <w:bCs w:val="1"/>
+          <w:color w:val="2f2e2e"/>
+        </w:rPr>
+      </w:pPr>
+      <w:r>
+        <w:rPr>
+          <w:b w:val="1"/>
+          <w:bCs w:val="1"/>
+          <w:color w:val="2f2e2e"/>
+          <w:rtl w:val="0"/>
+        </w:rPr>
+        <w:t xml:space="preserve">10. ІРИНА ЛЕХОЦІНСЬКА - </w:t>
+      </w:r>
+      <w:r>
+        <w:rPr>
+          <w:b w:val="1"/>
+          <w:bCs w:val="1"/>
+          <w:color w:val="2f2e2e"/>
+          <w:rtl w:val="0"/>
+        </w:rPr>
+        <w:t xml:space="preserve">Лікар-педіатр, Лікар ультразвукової діагностики</w:t>
+      </w:r>
+    </w:p>
+    <w:p>
+      <w:pPr>
+        <w:pBdr>
+          <w:top w:color="auto" w:space="0" w:sz="0" w:val="none"/>
+          <w:left w:color="auto" w:space="0" w:sz="0" w:val="none"/>
+          <w:bottom w:color="auto" w:space="0" w:sz="0" w:val="none"/>
+          <w:right w:color="auto" w:space="0" w:sz="0" w:val="none"/>
+          <w:between w:color="auto" w:space="0" w:sz="0" w:val="none"/>
+        </w:pBdr>
+        <w:rPr>
+          <w:color w:val="2f2e2e"/>
+        </w:rPr>
+      </w:pPr>
+      <w:r>
+        <w:rPr>
+          <w:b w:val="1"/>
+          <w:bCs w:val="1"/>
+          <w:color w:val="2f2e2e"/>
+          <w:rtl w:val="0"/>
+        </w:rPr>
+        <w:t xml:space="preserve">Освіта:</w:t>
+      </w:r>
+      <w:r>
+        <w:rPr>
+          <w:color w:val="2f2e2e"/>
+          <w:rtl w:val="0"/>
+        </w:rPr>
+        <w:t xml:space="preserve"> 2021р - спеціалізація «Ультразвукова діагностика» на базі кафедри</w:t>
+      </w:r>
+    </w:p>
+    <w:p>
+      <w:pPr>
+        <w:pBdr>
+          <w:top w:color="auto" w:space="0" w:sz="0" w:val="none"/>
+          <w:left w:color="auto" w:space="0" w:sz="0" w:val="none"/>
+          <w:bottom w:color="auto" w:space="0" w:sz="0" w:val="none"/>
+          <w:right w:color="auto" w:space="0" w:sz="0" w:val="none"/>
+          <w:between w:color="auto" w:space="0" w:sz="0" w:val="none"/>
+        </w:pBdr>
+        <w:rPr>
+          <w:color w:val="2f2e2e"/>
+        </w:rPr>
+      </w:pPr>
+      <w:r>
+        <w:rPr>
+          <w:color w:val="2f2e2e"/>
+          <w:rtl w:val="0"/>
+        </w:rPr>
+        <w:t xml:space="preserve">Променевої діагностики ФПДО ЛНМУ імені Данила Галицького та КНП ЛОР « Львівська обласна клінічна лікарня»</w:t>
+      </w:r>
+    </w:p>
+    <w:p>
+      <w:pPr>
+        <w:pBdr>
+          <w:top w:color="auto" w:space="0" w:sz="0" w:val="none"/>
+          <w:left w:color="auto" w:space="0" w:sz="0" w:val="none"/>
+          <w:bottom w:color="auto" w:space="0" w:sz="0" w:val="none"/>
+          <w:right w:color="auto" w:space="0" w:sz="0" w:val="none"/>
+          <w:between w:color="auto" w:space="0" w:sz="0" w:val="none"/>
+        </w:pBdr>
+        <w:rPr>
+          <w:color w:val="2f2e2e"/>
+        </w:rPr>
+      </w:pPr>
+      <w:r>
+        <w:rPr>
+          <w:color w:val="2f2e2e"/>
+          <w:rtl w:val="0"/>
+        </w:rPr>
+        <w:t xml:space="preserve">2018-2020pp - спеціалізація «Педіатрія» - інтернатура на базі кафедри</w:t>
+      </w:r>
+    </w:p>
+    <w:p>
+      <w:pPr>
+        <w:pBdr>
+          <w:top w:color="auto" w:space="0" w:sz="0" w:val="none"/>
+          <w:left w:color="auto" w:space="0" w:sz="0" w:val="none"/>
+          <w:bottom w:color="auto" w:space="0" w:sz="0" w:val="none"/>
+          <w:right w:color="auto" w:space="0" w:sz="0" w:val="none"/>
+          <w:between w:color="auto" w:space="0" w:sz="0" w:val="none"/>
+        </w:pBdr>
+        <w:rPr>
+          <w:color w:val="2f2e2e"/>
+        </w:rPr>
+      </w:pPr>
+      <w:r>
+        <w:rPr>
+          <w:color w:val="2f2e2e"/>
+          <w:rtl w:val="0"/>
+        </w:rPr>
+        <w:t xml:space="preserve">Педіатрії та неонатології ФПДО ЛНМУ імені Данила Галицького і на базі КНП ЛОР «ЗАХІДНОУКРАЇНСЬКИЙ СПЕЦІАЛІЗОВАНИЙ ДИТЯЧИЙ</w:t>
+      </w:r>
+    </w:p>
+    <w:p>
+      <w:pPr>
+        <w:pBdr>
+          <w:top w:color="auto" w:space="0" w:sz="0" w:val="none"/>
+          <w:left w:color="auto" w:space="0" w:sz="0" w:val="none"/>
+          <w:bottom w:color="auto" w:space="0" w:sz="0" w:val="none"/>
+          <w:right w:color="auto" w:space="0" w:sz="0" w:val="none"/>
+          <w:between w:color="auto" w:space="0" w:sz="0" w:val="none"/>
+        </w:pBdr>
+        <w:rPr>
+          <w:color w:val="2f2e2e"/>
+        </w:rPr>
+      </w:pPr>
+      <w:r>
+        <w:rPr>
+          <w:color w:val="2f2e2e"/>
+          <w:rtl w:val="0"/>
+        </w:rPr>
+        <w:t xml:space="preserve">МЕДИЧНИЙ ЦЕНТР»</w:t>
+      </w:r>
+    </w:p>
+    <w:p>
+      <w:pPr>
+        <w:pBdr>
+          <w:top w:color="auto" w:space="0" w:sz="0" w:val="none"/>
+          <w:left w:color="auto" w:space="0" w:sz="0" w:val="none"/>
+          <w:bottom w:color="auto" w:space="0" w:sz="0" w:val="none"/>
+          <w:right w:color="auto" w:space="0" w:sz="0" w:val="none"/>
+          <w:between w:color="auto" w:space="0" w:sz="0" w:val="none"/>
+        </w:pBdr>
+        <w:rPr>
+          <w:color w:val="2f2e2e"/>
+        </w:rPr>
+      </w:pPr>
+      <w:r>
+        <w:rPr>
+          <w:color w:val="2f2e2e"/>
+          <w:rtl w:val="0"/>
+        </w:rPr>
+        <w:t xml:space="preserve">2012-2018pp - Львівський національний медичний університет імені</w:t>
+      </w:r>
+    </w:p>
+    <w:p>
+      <w:pPr>
+        <w:pBdr>
+          <w:top w:color="auto" w:space="0" w:sz="0" w:val="none"/>
+          <w:left w:color="auto" w:space="0" w:sz="0" w:val="none"/>
+          <w:bottom w:color="auto" w:space="0" w:sz="0" w:val="none"/>
+          <w:right w:color="auto" w:space="0" w:sz="0" w:val="none"/>
+          <w:between w:color="auto" w:space="0" w:sz="0" w:val="none"/>
+        </w:pBdr>
+        <w:rPr>
+          <w:color w:val="2f2e2e"/>
+        </w:rPr>
+      </w:pPr>
+      <w:r>
+        <w:rPr>
+          <w:color w:val="2f2e2e"/>
+          <w:rtl w:val="0"/>
+        </w:rPr>
+        <w:t xml:space="preserve">Данила Галицького, факультет «Педіатрія»</w:t>
+      </w:r>
+    </w:p>
+    <w:p>
+      <w:pPr>
+        <w:pBdr>
+          <w:top w:color="auto" w:space="0" w:sz="0" w:val="none"/>
+          <w:left w:color="auto" w:space="0" w:sz="0" w:val="none"/>
+          <w:bottom w:color="auto" w:space="0" w:sz="0" w:val="none"/>
+          <w:right w:color="auto" w:space="0" w:sz="0" w:val="none"/>
+          <w:between w:color="auto" w:space="0" w:sz="0" w:val="none"/>
+        </w:pBdr>
+        <w:spacing w:after="60" w:before="60" w:lineRule="auto"/>
+        <w:rPr>
+          <w:b w:val="1"/>
+          <w:bCs w:val="1"/>
+          <w:color w:val="2f2e2e"/>
+        </w:rPr>
+      </w:pPr>
+      <w:r>
+        <w:rPr>
+          <w:b w:val="1"/>
+          <w:bCs w:val="1"/>
+          <w:color w:val="2f2e2e"/>
+          <w:rtl w:val="0"/>
+        </w:rPr>
+        <w:t xml:space="preserve">Чому обрала професію</w:t>
+      </w:r>
+      <w:r>
+        <w:rPr>
+          <w:color w:val="2f2e2e"/>
+          <w:rtl w:val="0"/>
+        </w:rPr>
+        <w:t xml:space="preserve">: </w:t>
+      </w:r>
+      <w:r>
+        <w:rPr>
+          <w:rtl w:val="0"/>
+        </w:rPr>
+        <w:t xml:space="preserve">Вибрала професію - бо завжди хотіла бути стоматологом з 5 років , коли почала їздити лікувати зубки , з того часу завжди пхала братові в зуби вату і паличками їх лікувала. А потім з 8 класу, мріяла вчитись із стипендією і бути незалежною від батьків )) тому поступила на лікувальну справу і педіатрію на державне - а вибрала педіатрію , бо діти більше милі і завжди кажуть правду , ніж дорослі </w:t>
+      </w:r>
+      <w:r>
+        <w:rPr>
+          <w:rtl w:val="0"/>
+        </w:rPr>
+      </w:r>
+    </w:p>
+    <w:p>
+      <w:pPr>
+        <w:pBdr>
+          <w:top w:color="auto" w:space="0" w:sz="0" w:val="none"/>
+          <w:left w:color="auto" w:space="0" w:sz="0" w:val="none"/>
+          <w:bottom w:color="auto" w:space="0" w:sz="0" w:val="none"/>
+          <w:right w:color="auto" w:space="0" w:sz="0" w:val="none"/>
+          <w:between w:color="auto" w:space="0" w:sz="0" w:val="none"/>
+        </w:pBdr>
+        <w:spacing w:after="60" w:before="60" w:lineRule="auto"/>
+        <w:rPr>
+          <w:color w:val="1d1c1d"/>
+        </w:rPr>
+      </w:pPr>
+      <w:r>
+        <w:rPr>
+          <w:b w:val="1"/>
+          <w:bCs w:val="1"/>
+          <w:color w:val="2f2e2e"/>
+          <w:rtl w:val="0"/>
+        </w:rPr>
+        <w:t xml:space="preserve">Про себе: </w:t>
+      </w:r>
+      <w:r>
+        <w:rPr>
+          <w:color w:val="2f2e2e"/>
+          <w:rtl w:val="0"/>
+        </w:rPr>
+        <w:t xml:space="preserve">л</w:t>
+      </w:r>
+      <w:r>
+        <w:rPr>
+          <w:color w:val="1d1c1d"/>
+          <w:rtl w:val="0"/>
+        </w:rPr>
+        <w:t xml:space="preserve">юблю подорожувати, гори. Люблю Францію , і все що з нею повʼязано </w:t>
+      </w:r>
+    </w:p>
+    <w:p>
+      <w:pPr>
+        <w:pBdr>
+          <w:top w:color="auto" w:space="0" w:sz="0" w:val="none"/>
+          <w:left w:color="auto" w:space="0" w:sz="0" w:val="none"/>
+          <w:bottom w:color="auto" w:space="0" w:sz="0" w:val="none"/>
+          <w:right w:color="auto" w:space="0" w:sz="0" w:val="none"/>
+          <w:between w:color="auto" w:space="0" w:sz="0" w:val="none"/>
+        </w:pBdr>
+        <w:spacing w:after="60" w:before="60" w:lineRule="auto"/>
+        <w:rPr>
+          <w:color w:val="1d1c1d"/>
+        </w:rPr>
+      </w:pPr>
+      <w:r>
+        <w:rPr>
+          <w:color w:val="1d1c1d"/>
+          <w:rtl w:val="0"/>
+        </w:rPr>
+        <w:t xml:space="preserve">Люблю каву з апельсиновим фрешом. Також дуже люблю спокій , тишу і книжку.</w:t>
+      </w:r>
+    </w:p>
+    <w:p>
+      <w:pPr>
+        <w:pBdr>
+          <w:top w:color="auto" w:space="0" w:sz="0" w:val="none"/>
+          <w:left w:color="auto" w:space="0" w:sz="0" w:val="none"/>
+          <w:bottom w:color="auto" w:space="0" w:sz="0" w:val="none"/>
+          <w:right w:color="auto" w:space="0" w:sz="0" w:val="none"/>
+          <w:between w:color="auto" w:space="0" w:sz="0" w:val="none"/>
+        </w:pBdr>
+        <w:spacing w:after="60" w:before="60" w:lineRule="auto"/>
+        <w:rPr>
+          <w:b w:val="1"/>
+          <w:bCs w:val="1"/>
+          <w:color w:val="2f2e2e"/>
+        </w:rPr>
+      </w:pPr>
+      <w:r>
+        <w:rPr>
+          <w:rtl w:val="0"/>
+        </w:rPr>
+        <w:t xml:space="preserve">Ще хотіла додати , що я би хотіла щоб знали пацієнти : що мій улюблений ідеальний  день - неділя , день , коли я проводжу його з близькими там сімʼєю , інколи в цей день я телефон в руки не беру весь день</w:t>
+      </w:r>
+      <w:r>
+        <w:rPr>
+          <w:rtl w:val="0"/>
+        </w:rPr>
+      </w:r>
+    </w:p>
+    <w:p>
+      <w:pPr>
+        <w:pBdr>
+          <w:top w:color="auto" w:space="0" w:sz="0" w:val="none"/>
+          <w:left w:color="auto" w:space="0" w:sz="0" w:val="none"/>
+          <w:bottom w:color="auto" w:space="0" w:sz="0" w:val="none"/>
+          <w:right w:color="auto" w:space="0" w:sz="0" w:val="none"/>
+          <w:between w:color="auto" w:space="0" w:sz="0" w:val="none"/>
+        </w:pBdr>
+        <w:spacing w:after="60" w:before="60" w:lineRule="auto"/>
+        <w:rPr>
+          <w:b w:val="1"/>
+          <w:bCs w:val="1"/>
+          <w:color w:val="2f2e2e"/>
+        </w:rPr>
+      </w:pPr>
+      <w:r>
+        <w:rPr>
+          <w:b w:val="1"/>
+          <w:bCs w:val="1"/>
+          <w:color w:val="2f2e2e"/>
+          <w:rtl w:val="0"/>
+        </w:rPr>
+        <w:t xml:space="preserve">Локація:</w:t>
+      </w:r>
+      <w:r>
+        <w:rPr>
+          <w:color w:val="2f2e2e"/>
+          <w:rtl w:val="0"/>
+        </w:rPr>
+        <w:t xml:space="preserve">  м.Львів вул.Стрийська 86В, Тичини 21</w:t>
+      </w:r>
+      <w:r>
+        <w:rPr>
+          <w:rtl w:val="0"/>
+        </w:rPr>
+      </w:r>
+    </w:p>
+    <w:p>
+      <w:pPr>
+        <w:pBdr>
+          <w:top w:color="auto" w:space="0" w:sz="0" w:val="none"/>
+          <w:left w:color="auto" w:space="0" w:sz="0" w:val="none"/>
+          <w:bottom w:color="auto" w:space="0" w:sz="0" w:val="none"/>
+          <w:right w:color="auto" w:space="0" w:sz="0" w:val="none"/>
+          <w:between w:color="auto" w:space="0" w:sz="0" w:val="none"/>
+        </w:pBdr>
+        <w:spacing w:after="60" w:before="60" w:lineRule="auto"/>
+        <w:rPr>
+          <w:b w:val="1"/>
+          <w:bCs w:val="1"/>
+          <w:color w:val="2f2e2e"/>
+        </w:rPr>
+      </w:pPr>
+      <w:r>
+        <w:pict>
+          <v:rect style="width:0.0pt;height:1.5pt" o:hr="t" o:hrstd="t" o:hralign="center" fillcolor="#A0A0A0" stroked="f"/>
+        </w:pict>
+      </w:r>
+      <w:r>
+        <w:rPr>
+          <w:rtl w:val="0"/>
+        </w:rPr>
+      </w:r>
+    </w:p>
+    <w:p>
+      <w:pPr>
+        <w:pBdr>
+          <w:top w:color="auto" w:space="0" w:sz="0" w:val="none"/>
+          <w:left w:color="auto" w:space="0" w:sz="0" w:val="none"/>
+          <w:bottom w:color="auto" w:space="0" w:sz="0" w:val="none"/>
+          <w:right w:color="auto" w:space="0" w:sz="0" w:val="none"/>
+          <w:between w:color="auto" w:space="0" w:sz="0" w:val="none"/>
+        </w:pBdr>
+        <w:spacing w:after="60" w:before="60" w:lineRule="auto"/>
+        <w:rPr>
+          <w:b w:val="1"/>
+          <w:bCs w:val="1"/>
+          <w:color w:val="2f2e2e"/>
+        </w:rPr>
+      </w:pPr>
+      <w:r>
+        <w:rPr>
+          <w:rtl w:val="0"/>
+        </w:rPr>
+      </w:r>
+    </w:p>
+    <w:p>
+      <w:pPr>
+        <w:pBdr>
+          <w:top w:color="auto" w:space="0" w:sz="0" w:val="none"/>
+          <w:left w:color="auto" w:space="0" w:sz="0" w:val="none"/>
+          <w:bottom w:color="auto" w:space="0" w:sz="0" w:val="none"/>
+          <w:right w:color="auto" w:space="0" w:sz="0" w:val="none"/>
+          <w:between w:color="auto" w:space="0" w:sz="0" w:val="none"/>
+        </w:pBdr>
+        <w:spacing w:after="60" w:before="60" w:lineRule="auto"/>
+        <w:rPr>
+          <w:b w:val="1"/>
+          <w:bCs w:val="1"/>
+          <w:color w:val="2f2e2e"/>
+        </w:rPr>
+      </w:pPr>
+      <w:r>
+        <w:rPr>
+          <w:b w:val="1"/>
+          <w:bCs w:val="1"/>
+          <w:color w:val="2f2e2e"/>
+          <w:rtl w:val="0"/>
+        </w:rPr>
+        <w:t xml:space="preserve">11. ЯРИНА ПІКУЛИЦЬКА - Засновниця, Директорка Вулика, лікарка-педіатр, доктор біоетики</w:t>
+      </w:r>
+    </w:p>
+    <w:p>
+      <w:pPr>
+        <w:pBdr>
+          <w:top w:color="auto" w:space="0" w:sz="0" w:val="none"/>
+          <w:left w:color="auto" w:space="0" w:sz="0" w:val="none"/>
+          <w:bottom w:color="auto" w:space="0" w:sz="0" w:val="none"/>
+          <w:right w:color="auto" w:space="0" w:sz="0" w:val="none"/>
+          <w:between w:color="auto" w:space="0" w:sz="0" w:val="none"/>
+        </w:pBdr>
+        <w:spacing w:after="60" w:before="60" w:lineRule="auto"/>
+        <w:rPr>
+          <w:color w:val="2f2e2e"/>
+        </w:rPr>
+      </w:pPr>
+      <w:r>
+        <w:rPr>
+          <w:b w:val="1"/>
+          <w:bCs w:val="1"/>
+          <w:color w:val="2f2e2e"/>
+          <w:rtl w:val="0"/>
+        </w:rPr>
+        <w:t xml:space="preserve">Освіта: </w:t>
+      </w:r>
+      <w:r>
+        <w:rPr>
+          <w:color w:val="2f2e2e"/>
+          <w:rtl w:val="0"/>
+        </w:rPr>
+        <w:t xml:space="preserve">ЛНМУ ім. Данила Галицького, Університет Лойола (Чикаго, США)</w:t>
+        <w:br w:type="textWrapping"/>
+        <w:t xml:space="preserve">Основний навик: педіатрія, організація та управління охорони здоров’я, біоетика і політика охорони здоров’я</w:t>
+      </w:r>
+    </w:p>
+    <w:p>
+      <w:pPr>
+        <w:pBdr>
+          <w:top w:color="auto" w:space="0" w:sz="0" w:val="none"/>
+          <w:left w:color="auto" w:space="0" w:sz="0" w:val="none"/>
+          <w:bottom w:color="auto" w:space="0" w:sz="0" w:val="none"/>
+          <w:right w:color="auto" w:space="0" w:sz="0" w:val="none"/>
+          <w:between w:color="auto" w:space="0" w:sz="0" w:val="none"/>
+        </w:pBdr>
+        <w:spacing w:after="60" w:before="60" w:lineRule="auto"/>
+        <w:rPr>
+          <w:color w:val="2f2e2e"/>
+        </w:rPr>
+      </w:pPr>
+      <w:r>
+        <w:rPr>
+          <w:color w:val="2f2e2e"/>
+          <w:rtl w:val="0"/>
+        </w:rPr>
+        <w:t xml:space="preserve">Кількість років у медицині - 10+</w:t>
+        <w:br w:type="textWrapping"/>
+      </w:r>
+      <w:r>
+        <w:rPr>
+          <w:b w:val="1"/>
+          <w:bCs w:val="1"/>
+          <w:color w:val="2f2e2e"/>
+          <w:rtl w:val="0"/>
+        </w:rPr>
+        <w:t xml:space="preserve">Чому обрала професію</w:t>
+      </w:r>
+      <w:r>
+        <w:rPr>
+          <w:color w:val="2f2e2e"/>
+          <w:rtl w:val="0"/>
+        </w:rPr>
+        <w:t xml:space="preserve">: коли постав момент обирати професію, я чітко розуміла, що я хочу допомагати людям. Звісно, допомагати можна по-різному. Однак мені здавалось, що в медицині це найбільш намацально. А другий чинник - це усвідомлення, що в медицині постійно треба вчитись. І я подумала, що це добре, коли в житті є щось, що постійно стимулює ставати кращим.</w:t>
+      </w:r>
+    </w:p>
+    <w:p>
+      <w:pPr>
+        <w:pBdr>
+          <w:top w:color="auto" w:space="0" w:sz="0" w:val="none"/>
+          <w:left w:color="auto" w:space="0" w:sz="0" w:val="none"/>
+          <w:bottom w:color="auto" w:space="0" w:sz="0" w:val="none"/>
+          <w:right w:color="auto" w:space="0" w:sz="0" w:val="none"/>
+          <w:between w:color="auto" w:space="0" w:sz="0" w:val="none"/>
+        </w:pBdr>
+        <w:spacing w:after="60" w:before="60" w:lineRule="auto"/>
+        <w:rPr>
+          <w:color w:val="2f2e2e"/>
+        </w:rPr>
+      </w:pPr>
+      <w:r>
+        <w:rPr>
+          <w:b w:val="1"/>
+          <w:bCs w:val="1"/>
+          <w:color w:val="2f2e2e"/>
+          <w:rtl w:val="0"/>
+        </w:rPr>
+        <w:t xml:space="preserve">Про себе</w:t>
+      </w:r>
+      <w:r>
+        <w:rPr>
+          <w:color w:val="2f2e2e"/>
+          <w:rtl w:val="0"/>
+        </w:rPr>
+        <w:t xml:space="preserve">: маю багато ролей у своєму житті, однак наймилішою є роль лікаря-педіатра. З позиції побудови стосунку між лікарем і пацієнтом будую і менеджемент клініки, і беру участь у великій кількості заходів присвяченій побудові системі охорони здоров’я. Переконана, що медицина має бути людиноцентричною, побудованою на партнерських і прозорих відносинах. З розвитком Вулика переконуюсь, що завдання не з легких, бо медицина є неймовірно динамічною галуззю. Але в цей момент завжди повертаюсь до первинного - стосунку між лікарем і пацієнтом на прийомі, і тоді знаходжу рішення, як краще будувати Вулик. Материнство дуже допомагає розуміти запит сім’ї на рівні первинної медичної допомоги.</w:t>
+        <w:br w:type="textWrapping"/>
+      </w:r>
+      <w:r>
+        <w:rPr>
+          <w:b w:val="1"/>
+          <w:bCs w:val="1"/>
+          <w:color w:val="2f2e2e"/>
+          <w:rtl w:val="0"/>
+        </w:rPr>
+        <w:t xml:space="preserve">Локації</w:t>
+      </w:r>
+      <w:r>
+        <w:rPr>
+          <w:color w:val="2f2e2e"/>
+          <w:rtl w:val="0"/>
+        </w:rPr>
+        <w:t xml:space="preserve">: Тичини 21, Стрийська 86В</w:t>
+      </w:r>
+    </w:p>
+    <w:p>
+      <w:pPr>
+        <w:pBdr>
+          <w:top w:color="auto" w:space="0" w:sz="0" w:val="none"/>
+          <w:left w:color="auto" w:space="0" w:sz="0" w:val="none"/>
+          <w:bottom w:color="auto" w:space="0" w:sz="0" w:val="none"/>
+          <w:right w:color="auto" w:space="0" w:sz="0" w:val="none"/>
+          <w:between w:color="auto" w:space="0" w:sz="0" w:val="none"/>
+        </w:pBdr>
+        <w:spacing w:after="60" w:before="60" w:lineRule="auto"/>
+        <w:rPr>
+          <w:color w:val="2f2e2e"/>
+        </w:rPr>
+      </w:pPr>
+      <w:r>
+        <w:rPr>
+          <w:rtl w:val="0"/>
+        </w:rPr>
+      </w:r>
+    </w:p>
+    <w:p>
+      <w:pPr>
+        <w:rPr>
+          <w:color w:val="2f2e2e"/>
         </w:rPr>
       </w:pPr>
       <w:r>
@@ -3214,8 +3217,6 @@
         <w:ind w:left="720" w:firstLine="0"/>
         <w:rPr>
           <w:color w:val="1d1c1d"/>
-          <w:sz w:val="24"/>
-          <w:szCs w:val="24"/>
         </w:rPr>
       </w:pPr>
       <w:r>
@@ -3237,30 +3238,26 @@
         <w:ind w:left="720" w:firstLine="0"/>
         <w:rPr>
           <w:color w:val="1d1c1d"/>
-          <w:sz w:val="24"/>
-          <w:szCs w:val="24"/>
-        </w:rPr>
-      </w:pPr>
-      <w:r>
-        <w:rPr>
-          <w:rtl w:val="0"/>
-        </w:rPr>
-      </w:r>
-    </w:p>
-    <w:p>
-      <w:pPr>
-        <w:pBdr>
-          <w:top w:color="auto" w:space="0" w:sz="0" w:val="none"/>
-          <w:left w:color="auto" w:space="0" w:sz="0" w:val="none"/>
-          <w:bottom w:color="auto" w:space="0" w:sz="0" w:val="none"/>
-          <w:right w:color="auto" w:space="0" w:sz="0" w:val="none"/>
-          <w:between w:color="auto" w:space="0" w:sz="0" w:val="none"/>
-        </w:pBdr>
-        <w:spacing w:after="60" w:before="60" w:lineRule="auto"/>
-        <w:rPr>
-          <w:color w:val="2f2e2e"/>
-          <w:sz w:val="24"/>
-          <w:szCs w:val="24"/>
+        </w:rPr>
+      </w:pPr>
+      <w:r>
+        <w:rPr>
+          <w:rtl w:val="0"/>
+        </w:rPr>
+      </w:r>
+    </w:p>
+    <w:p>
+      <w:pPr>
+        <w:pBdr>
+          <w:top w:color="auto" w:space="0" w:sz="0" w:val="none"/>
+          <w:left w:color="auto" w:space="0" w:sz="0" w:val="none"/>
+          <w:bottom w:color="auto" w:space="0" w:sz="0" w:val="none"/>
+          <w:right w:color="auto" w:space="0" w:sz="0" w:val="none"/>
+          <w:between w:color="auto" w:space="0" w:sz="0" w:val="none"/>
+        </w:pBdr>
+        <w:spacing w:after="60" w:before="60" w:lineRule="auto"/>
+        <w:rPr>
+          <w:color w:val="2f2e2e"/>
         </w:rPr>
       </w:pPr>
       <w:r>

</xml_diff>